<commit_message>
Update Flashover doc: Soft/Hard clipping, MIDI chaining, endless knobs
Adds a Soft (germanium) / Hard (silicon) clipping toggle, explains how
one Switchyard MIDI output controls several pedals via channels and
MIDI thru, and settles on endless knobs with LED rings. Updates
hardware, costs, next steps and open questions to match.

Co-Authored-By: Claude Opus 5.5 <noreply@anthropic.com>
</commit_message>
<xml_diff>
--- a/pedals/distortion/Flashover Product Document.docx
+++ b/pedals/distortion/Flashover Product Document.docx
@@ -280,7 +280,7 @@
         <w:t xml:space="preserve">On its own,</w:t>
       </w:r>
       <w:r>
-        <w:t xml:space="preserve"> as a normal distortion pedal: guitar in, amp out, three knobs and an on/off footswitch.</w:t>
+        <w:t xml:space="preserve"> as a normal distortion pedal: guitar in, amp out, three knobs, a Soft/Hard clipping switch and an on/off footswitch.</w:t>
       </w:r>
     </w:p>
     <w:p>
@@ -298,7 +298,7 @@
         <w:t xml:space="preserve">Linked to Switchyard,</w:t>
       </w:r>
       <w:r>
-        <w:t xml:space="preserve"> the Linework control pedal. Switchyard can turn Flashover on and off and set all three knobs automatically for each part of each song.</w:t>
+        <w:t xml:space="preserve"> the Linework control pedal. Switchyard can turn Flashover on and off, set all three knobs and choose the clipping mode automatically for each part of each song.</w:t>
       </w:r>
     </w:p>
     <w:p>
@@ -515,6 +515,55 @@
               <w:spacing w:before="0" w:after="0"/>
             </w:pPr>
             <w:r>
+              <w:t xml:space="preserve">Soft / Hard switch</w:t>
+            </w:r>
+          </w:p>
+        </w:tc>
+        <w:tc>
+          <w:tcPr>
+            <w:tcW w:w="7360" w:type="dxa"/>
+          </w:tcPr>
+          <w:p>
+            <w:pPr>
+              <w:spacing w:before="0" w:after="0"/>
+            </w:pPr>
+            <w:r>
+              <w:t xml:space="preserve">A toggle switch that chooses the clipping diodes: </w:t>
+            </w:r>
+            <w:r>
+              <w:rPr>
+                <w:b/>
+              </w:rPr>
+              <w:t xml:space="preserve">Soft</w:t>
+            </w:r>
+            <w:r>
+              <w:t xml:space="preserve"> uses germanium diodes, </w:t>
+            </w:r>
+            <w:r>
+              <w:rPr>
+                <w:b/>
+              </w:rPr>
+              <w:t xml:space="preserve">Hard</w:t>
+            </w:r>
+            <w:r>
+              <w:t xml:space="preserve"> uses silicon diodes</w:t>
+            </w:r>
+          </w:p>
+        </w:tc>
+      </w:tr>
+      <w:tr>
+        <w:trPr>
+          <w:cantSplit/>
+        </w:trPr>
+        <w:tc>
+          <w:tcPr>
+            <w:tcW w:w="2000" w:type="dxa"/>
+          </w:tcPr>
+          <w:p>
+            <w:pPr>
+              <w:spacing w:before="0" w:after="0"/>
+            </w:pPr>
+            <w:r>
               <w:t xml:space="preserve">Footswitch</w:t>
             </w:r>
           </w:p>
@@ -566,6 +615,20 @@
       </w:tr>
     </w:tbl>
     <w:p/>
+    <w:p>
+      <w:r>
+        <w:t xml:space="preserve">Gain, Tone and Level are </w:t>
+      </w:r>
+      <w:r>
+        <w:rPr>
+          <w:b/>
+        </w:rPr>
+        <w:t xml:space="preserve">endless knobs with LED rings</w:t>
+      </w:r>
+      <w:r>
+        <w:t xml:space="preserve">, described under “How the knobs work” below.</w:t>
+      </w:r>
+    </w:p>
     <w:p>
       <w:pPr>
         <w:pStyle w:val="Heading1"/>
@@ -589,7 +652,7 @@
         <w:t xml:space="preserve">Gain stage and clipping:</w:t>
       </w:r>
       <w:r>
-        <w:t xml:space="preserve"> taken from the existing GS1 design, a Distortion+-style circuit with one op-amp gain stage and germanium clipping diodes. It’s already drawn in KiCad and simulated in LTspice.</w:t>
+        <w:t xml:space="preserve"> taken from the existing GS1 design, a Distortion+-style circuit with one op-amp gain stage and a pair of clipping diodes (now switchable; see Soft / Hard clipping below). It’s already drawn in KiCad and simulated in LTspice.</w:t>
       </w:r>
     </w:p>
     <w:p>
@@ -612,6 +675,190 @@
     </w:p>
     <w:p>
       <w:pPr>
+        <w:pStyle w:val="Heading2"/>
+      </w:pPr>
+      <w:r>
+        <w:t xml:space="preserve">Soft / Hard clipping</w:t>
+      </w:r>
+    </w:p>
+    <w:p>
+      <w:r>
+        <w:t xml:space="preserve">The clipping diodes are what turn the boosted signal into distortion. The two settings use different diode types:</w:t>
+      </w:r>
+    </w:p>
+    <w:tbl>
+      <w:tblPr>
+        <w:tblW w:w="9360" w:type="dxa"/>
+        <w:tblBorders>
+          <w:top w:val="single" w:sz="4" w:space="0" w:color="A0A0A0"/>
+          <w:left w:val="single" w:sz="4" w:space="0" w:color="A0A0A0"/>
+          <w:bottom w:val="single" w:sz="4" w:space="0" w:color="A0A0A0"/>
+          <w:right w:val="single" w:sz="4" w:space="0" w:color="A0A0A0"/>
+          <w:insideH w:val="single" w:sz="4" w:space="0" w:color="A0A0A0"/>
+          <w:insideV w:val="single" w:sz="4" w:space="0" w:color="A0A0A0"/>
+        </w:tblBorders>
+        <w:tblLayout w:type="fixed"/>
+        <w:tblCellMar>
+          <w:top w:w="40" w:type="dxa"/>
+          <w:left w:w="100" w:type="dxa"/>
+          <w:bottom w:w="40" w:type="dxa"/>
+          <w:right w:w="100" w:type="dxa"/>
+        </w:tblCellMar>
+      </w:tblPr>
+      <w:tblGrid>
+        <w:gridCol w:w="1400"/>
+        <w:gridCol w:w="3360"/>
+        <w:gridCol w:w="4600"/>
+      </w:tblGrid>
+      <w:tr>
+        <w:trPr>
+          <w:cantSplit/>
+          <w:tblHeader/>
+        </w:trPr>
+        <w:tc>
+          <w:tcPr>
+            <w:tcW w:w="1400" w:type="dxa"/>
+            <w:shd w:val="clear" w:color="auto" w:fill="E7E6E6"/>
+          </w:tcPr>
+          <w:p>
+            <w:pPr>
+              <w:spacing w:before="0" w:after="0"/>
+            </w:pPr>
+            <w:r>
+              <w:rPr>
+                <w:b/>
+              </w:rPr>
+              <w:t xml:space="preserve">Setting</w:t>
+            </w:r>
+          </w:p>
+        </w:tc>
+        <w:tc>
+          <w:tcPr>
+            <w:tcW w:w="3360" w:type="dxa"/>
+            <w:shd w:val="clear" w:color="auto" w:fill="E7E6E6"/>
+          </w:tcPr>
+          <w:p>
+            <w:pPr>
+              <w:spacing w:before="0" w:after="0"/>
+            </w:pPr>
+            <w:r>
+              <w:rPr>
+                <w:b/>
+              </w:rPr>
+              <w:t xml:space="preserve">Diodes</w:t>
+            </w:r>
+          </w:p>
+        </w:tc>
+        <w:tc>
+          <w:tcPr>
+            <w:tcW w:w="4600" w:type="dxa"/>
+            <w:shd w:val="clear" w:color="auto" w:fill="E7E6E6"/>
+          </w:tcPr>
+          <w:p>
+            <w:pPr>
+              <w:spacing w:before="0" w:after="0"/>
+            </w:pPr>
+            <w:r>
+              <w:rPr>
+                <w:b/>
+              </w:rPr>
+              <w:t xml:space="preserve">Sound</w:t>
+            </w:r>
+          </w:p>
+        </w:tc>
+      </w:tr>
+      <w:tr>
+        <w:trPr>
+          <w:cantSplit/>
+        </w:trPr>
+        <w:tc>
+          <w:tcPr>
+            <w:tcW w:w="1400" w:type="dxa"/>
+          </w:tcPr>
+          <w:p>
+            <w:pPr>
+              <w:spacing w:before="0" w:after="0"/>
+            </w:pPr>
+            <w:r>
+              <w:t xml:space="preserve">Soft</w:t>
+            </w:r>
+          </w:p>
+        </w:tc>
+        <w:tc>
+          <w:tcPr>
+            <w:tcW w:w="3360" w:type="dxa"/>
+          </w:tcPr>
+          <w:p>
+            <w:pPr>
+              <w:spacing w:before="0" w:after="0"/>
+            </w:pPr>
+            <w:r>
+              <w:t xml:space="preserve">Germanium (1N34A, as in the current GS1 design)</w:t>
+            </w:r>
+          </w:p>
+        </w:tc>
+        <w:tc>
+          <w:tcPr>
+            <w:tcW w:w="4600" w:type="dxa"/>
+          </w:tcPr>
+          <w:p>
+            <w:pPr>
+              <w:spacing w:before="0" w:after="0"/>
+            </w:pPr>
+            <w:r>
+              <w:t xml:space="preserve">Start clipping at a low voltage and round off the peaks gradually. Smoother, warmer, more like overdrive</w:t>
+            </w:r>
+          </w:p>
+        </w:tc>
+      </w:tr>
+      <w:tr>
+        <w:trPr>
+          <w:cantSplit/>
+        </w:trPr>
+        <w:tc>
+          <w:tcPr>
+            <w:tcW w:w="1400" w:type="dxa"/>
+          </w:tcPr>
+          <w:p>
+            <w:pPr>
+              <w:spacing w:before="0" w:after="0"/>
+            </w:pPr>
+            <w:r>
+              <w:t xml:space="preserve">Hard</w:t>
+            </w:r>
+          </w:p>
+        </w:tc>
+        <w:tc>
+          <w:tcPr>
+            <w:tcW w:w="3360" w:type="dxa"/>
+          </w:tcPr>
+          <w:p>
+            <w:pPr>
+              <w:spacing w:before="0" w:after="0"/>
+            </w:pPr>
+            <w:r>
+              <w:t xml:space="preserve">Silicon (e.g. 1N4148, as used in the DS-1)</w:t>
+            </w:r>
+          </w:p>
+        </w:tc>
+        <w:tc>
+          <w:tcPr>
+            <w:tcW w:w="4600" w:type="dxa"/>
+          </w:tcPr>
+          <w:p>
+            <w:pPr>
+              <w:spacing w:before="0" w:after="0"/>
+            </w:pPr>
+            <w:r>
+              <w:t xml:space="preserve">Clip more abruptly, giving a sharper edge and more of a classic distortion sound</w:t>
+            </w:r>
+          </w:p>
+        </w:tc>
+      </w:tr>
+    </w:tbl>
+    <w:p/>
+    <w:p>
+      <w:pPr>
         <w:pStyle w:val="ListParagraph"/>
         <w:numPr>
           <w:ilvl w:val="0"/>
@@ -622,26 +869,10 @@
         <w:rPr>
           <w:b/>
         </w:rPr>
-        <w:t xml:space="preserve">Possible later option:</w:t>
-      </w:r>
-      <w:r>
-        <w:t xml:space="preserve"> a switch to choose between clipping diode types (for example germanium for a softer overdrive and silicon for a harder distortion).</w:t>
-      </w:r>
-    </w:p>
-    <w:p>
-      <w:pPr>
-        <w:pStyle w:val="Heading1"/>
-      </w:pPr>
-      <w:r>
-        <w:t xml:space="preserve">Working with Switchyard</w:t>
-      </w:r>
-    </w:p>
-    <w:p>
-      <w:pPr>
-        <w:pStyle w:val="Heading2"/>
-      </w:pPr>
-      <w:r>
-        <w:t xml:space="preserve">Connection</w:t>
+        <w:t xml:space="preserve">How it switches:</w:t>
+      </w:r>
+      <w:r>
+        <w:t xml:space="preserve"> both pairs of diodes are on the board. The toggle is read by the microcontroller, which connects one pair or the other using a small relay or electronic switch. That lets Switchyard set the mode too (see the MIDI messages below).</w:t>
       </w:r>
     </w:p>
     <w:p>
@@ -653,25 +884,13 @@
         </w:numPr>
       </w:pPr>
       <w:r>
-        <w:t xml:space="preserve">Flashover has a </w:t>
-      </w:r>
-      <w:r>
         <w:rPr>
           <w:b/>
         </w:rPr>
-        <w:t xml:space="preserve">MIDI in</w:t>
-      </w:r>
-      <w:r>
-        <w:t xml:space="preserve"> jack and a </w:t>
-      </w:r>
-      <w:r>
-        <w:rPr>
-          <w:b/>
-        </w:rPr>
-        <w:t xml:space="preserve">MIDI thru</w:t>
-      </w:r>
-      <w:r>
-        <w:t xml:space="preserve"> jack (both 3.5 mm TRS). Switchyard connects to MIDI in, and MIDI thru passes the same messages on to the next pedal in the chain.</w:t>
+        <w:t xml:space="preserve">Volume difference:</w:t>
+      </w:r>
+      <w:r>
+        <w:t xml:space="preserve"> silicon diodes let the signal get louder before clipping, so Hard mode is noticeably louder. The microcontroller can adjust the output level automatically when the mode changes, so the volume stays even. The amount is to be set from the simulation.</w:t>
       </w:r>
     </w:p>
     <w:p>
@@ -683,7 +902,238 @@
         </w:numPr>
       </w:pPr>
       <w:r>
-        <w:t xml:space="preserve">Each Linework pedal is set to its own MIDI channel.</w:t>
+        <w:rPr>
+          <w:b/>
+        </w:rPr>
+        <w:t xml:space="preserve">When Switchyard changes the mode,</w:t>
+      </w:r>
+      <w:r>
+        <w:t xml:space="preserve"> the toggle’s lever may no longer match the actual setting. Two small LEDs labelled Soft and Hard always show the active mode, and flipping the toggle sets the mode to match the lever.</w:t>
+      </w:r>
+    </w:p>
+    <w:p>
+      <w:pPr>
+        <w:pStyle w:val="Heading1"/>
+      </w:pPr>
+      <w:r>
+        <w:t xml:space="preserve">Working with Switchyard</w:t>
+      </w:r>
+    </w:p>
+    <w:p>
+      <w:pPr>
+        <w:pStyle w:val="Heading2"/>
+      </w:pPr>
+      <w:r>
+        <w:t xml:space="preserve">One MIDI output controls all the pedals</w:t>
+      </w:r>
+    </w:p>
+    <w:p>
+      <w:r>
+        <w:t xml:space="preserve">Switchyard needs only </w:t>
+      </w:r>
+      <w:r>
+        <w:rPr>
+          <w:b/>
+        </w:rPr>
+        <w:t xml:space="preserve">one</w:t>
+      </w:r>
+      <w:r>
+        <w:t xml:space="preserve"> MIDI output socket, however many Linework pedals are connected. Each pedal does </w:t>
+      </w:r>
+      <w:r>
+        <w:rPr>
+          <w:b/>
+        </w:rPr>
+        <w:t xml:space="preserve">not</w:t>
+      </w:r>
+      <w:r>
+        <w:t xml:space="preserve"> need its own socket on Switchyard. Two standard MIDI features make this work:</w:t>
+      </w:r>
+    </w:p>
+    <w:p>
+      <w:pPr>
+        <w:pStyle w:val="ListParagraph"/>
+        <w:numPr>
+          <w:ilvl w:val="0"/>
+          <w:numId w:val="90"/>
+        </w:numPr>
+      </w:pPr>
+      <w:r>
+        <w:rPr>
+          <w:b/>
+        </w:rPr>
+        <w:t xml:space="preserve">Channels:</w:t>
+      </w:r>
+      <w:r>
+        <w:t xml:space="preserve"> every MIDI message carries a channel number from 1 to 16. Each pedal is set to its own channel and ignores messages for any other channel. Flashover might be channel 1, a phaser channel 2, and so on.</w:t>
+      </w:r>
+    </w:p>
+    <w:p>
+      <w:pPr>
+        <w:pStyle w:val="ListParagraph"/>
+        <w:numPr>
+          <w:ilvl w:val="0"/>
+          <w:numId w:val="90"/>
+        </w:numPr>
+      </w:pPr>
+      <w:r>
+        <w:rPr>
+          <w:b/>
+        </w:rPr>
+        <w:t xml:space="preserve">MIDI thru (daisy-chaining):</w:t>
+      </w:r>
+      <w:r>
+        <w:t xml:space="preserve"> each pedal has a MIDI in jack and a MIDI thru jack. Everything that arrives at MIDI in is copied straight out of MIDI thru to the next pedal.</w:t>
+      </w:r>
+    </w:p>
+    <w:p>
+      <w:pPr>
+        <w:keepNext/>
+      </w:pPr>
+      <w:r>
+        <w:rPr>
+          <w:b/>
+        </w:rPr>
+        <w:t xml:space="preserve">Example with three pedals:</w:t>
+      </w:r>
+    </w:p>
+    <w:p>
+      <w:pPr>
+        <w:pStyle w:val="ListParagraph"/>
+        <w:numPr>
+          <w:ilvl w:val="0"/>
+          <w:numId w:val="90"/>
+        </w:numPr>
+      </w:pPr>
+      <w:r>
+        <w:t xml:space="preserve">Switchyard MIDI out → Flashover MIDI in (channel 1)</w:t>
+      </w:r>
+    </w:p>
+    <w:p>
+      <w:pPr>
+        <w:pStyle w:val="ListParagraph"/>
+        <w:numPr>
+          <w:ilvl w:val="0"/>
+          <w:numId w:val="90"/>
+        </w:numPr>
+      </w:pPr>
+      <w:r>
+        <w:t xml:space="preserve">Flashover MIDI thru → second pedal MIDI in (channel 2)</w:t>
+      </w:r>
+    </w:p>
+    <w:p>
+      <w:pPr>
+        <w:pStyle w:val="ListParagraph"/>
+        <w:numPr>
+          <w:ilvl w:val="0"/>
+          <w:numId w:val="90"/>
+        </w:numPr>
+      </w:pPr>
+      <w:r>
+        <w:t xml:space="preserve">Second pedal MIDI thru → third pedal MIDI in (channel 3)</w:t>
+      </w:r>
+    </w:p>
+    <w:p>
+      <w:r>
+        <w:t xml:space="preserve">When the player steps to the next part, Switchyard sends one burst of messages down the chain: Flashover’s new settings on channel 1, the second pedal’s on channel 2, and the third pedal’s on channel 3. Every pedal sees every message but only acts on its own channel.</w:t>
+      </w:r>
+    </w:p>
+    <w:p>
+      <w:pPr>
+        <w:pStyle w:val="Heading2"/>
+      </w:pPr>
+      <w:r>
+        <w:t xml:space="preserve">Limits and details</w:t>
+      </w:r>
+    </w:p>
+    <w:p>
+      <w:pPr>
+        <w:pStyle w:val="ListParagraph"/>
+        <w:numPr>
+          <w:ilvl w:val="0"/>
+          <w:numId w:val="90"/>
+        </w:numPr>
+      </w:pPr>
+      <w:r>
+        <w:rPr>
+          <w:b/>
+        </w:rPr>
+        <w:t xml:space="preserve">Up to 16 pedals</w:t>
+      </w:r>
+      <w:r>
+        <w:t xml:space="preserve"> can be controlled independently, one per channel. Pedals set to the same channel would always move together.</w:t>
+      </w:r>
+    </w:p>
+    <w:p>
+      <w:pPr>
+        <w:pStyle w:val="ListParagraph"/>
+        <w:numPr>
+          <w:ilvl w:val="0"/>
+          <w:numId w:val="90"/>
+        </w:numPr>
+      </w:pPr>
+      <w:r>
+        <w:rPr>
+          <w:b/>
+        </w:rPr>
+        <w:t xml:space="preserve">Speed:</w:t>
+      </w:r>
+      <w:r>
+        <w:t xml:space="preserve"> MIDI is slow by modern standards, but the messages are tiny. Each Flashover message takes about 1 ms to send, and a full update for one pedal (gain, tone, level, clipping mode and on/off) takes about 5 ms. Updating six pedals takes roughly 30 ms, which is fast enough that the change feels instant.</w:t>
+      </w:r>
+    </w:p>
+    <w:p>
+      <w:pPr>
+        <w:pStyle w:val="ListParagraph"/>
+        <w:numPr>
+          <w:ilvl w:val="0"/>
+          <w:numId w:val="90"/>
+        </w:numPr>
+      </w:pPr>
+      <w:r>
+        <w:rPr>
+          <w:b/>
+        </w:rPr>
+        <w:t xml:space="preserve">Long chains:</w:t>
+      </w:r>
+      <w:r>
+        <w:t xml:space="preserve"> each pedal passes the signal through electronically, which is reliable for a typical pedalboard of up to about 6–8 pedals. For bigger setups, a MIDI “thru box” (a splitter) or a second output on Switchyard can feed two shorter chains. That’s an open question in the Switchyard document.</w:t>
+      </w:r>
+    </w:p>
+    <w:p>
+      <w:pPr>
+        <w:pStyle w:val="ListParagraph"/>
+        <w:numPr>
+          <w:ilvl w:val="0"/>
+          <w:numId w:val="90"/>
+        </w:numPr>
+      </w:pPr>
+      <w:r>
+        <w:rPr>
+          <w:b/>
+        </w:rPr>
+        <w:t xml:space="preserve">Setting the channel:</w:t>
+      </w:r>
+      <w:r>
+        <w:t xml:space="preserve"> to be decided. One simple approach is to hold the footswitch while plugging in power, which puts the pedal in a setup mode; the app then assigns the channel through Switchyard.</w:t>
+      </w:r>
+    </w:p>
+    <w:p>
+      <w:pPr>
+        <w:pStyle w:val="ListParagraph"/>
+        <w:numPr>
+          <w:ilvl w:val="0"/>
+          <w:numId w:val="90"/>
+        </w:numPr>
+      </w:pPr>
+      <w:r>
+        <w:rPr>
+          <w:b/>
+        </w:rPr>
+        <w:t xml:space="preserve">Cables:</w:t>
+      </w:r>
+      <w:r>
+        <w:t xml:space="preserve"> 3.5 mm TRS MIDI cables (the common “Type A” wiring). Power is separate; MIDI cables carry only the control messages, not audio or power.</w:t>
       </w:r>
     </w:p>
     <w:p>
@@ -951,6 +1401,50 @@
           </w:p>
         </w:tc>
       </w:tr>
+      <w:tr>
+        <w:trPr>
+          <w:cantSplit/>
+        </w:trPr>
+        <w:tc>
+          <w:tcPr>
+            <w:tcW w:w="2600" w:type="dxa"/>
+          </w:tcPr>
+          <w:p>
+            <w:pPr>
+              <w:spacing w:before="0" w:after="0"/>
+            </w:pPr>
+            <w:r>
+              <w:t xml:space="preserve">CC 24</w:t>
+            </w:r>
+          </w:p>
+        </w:tc>
+        <w:tc>
+          <w:tcPr>
+            <w:tcW w:w="2600" w:type="dxa"/>
+          </w:tcPr>
+          <w:p>
+            <w:pPr>
+              <w:spacing w:before="0" w:after="0"/>
+            </w:pPr>
+            <w:r>
+              <w:t xml:space="preserve">Clipping mode</w:t>
+            </w:r>
+          </w:p>
+        </w:tc>
+        <w:tc>
+          <w:tcPr>
+            <w:tcW w:w="4160" w:type="dxa"/>
+          </w:tcPr>
+          <w:p>
+            <w:pPr>
+              <w:spacing w:before="0" w:after="0"/>
+            </w:pPr>
+            <w:r>
+              <w:t xml:space="preserve">0–63 Soft, 64–127 Hard</w:t>
+            </w:r>
+          </w:p>
+        </w:tc>
+      </w:tr>
     </w:tbl>
     <w:p/>
     <w:p>
@@ -960,241 +1454,116 @@
     </w:p>
     <w:p>
       <w:pPr>
-        <w:pStyle w:val="Heading2"/>
-      </w:pPr>
-      <w:r>
-        <w:t xml:space="preserve">How the knobs work when linked</w:t>
-      </w:r>
-    </w:p>
-    <w:p>
-      <w:r>
-        <w:t xml:space="preserve">A normal knob in the audio circuit can’t be changed remotely, so remote control needs </w:t>
+        <w:pStyle w:val="Heading1"/>
+      </w:pPr>
+      <w:r>
+        <w:t xml:space="preserve">How the knobs work</w:t>
+      </w:r>
+    </w:p>
+    <w:p>
+      <w:r>
+        <w:t xml:space="preserve">Gain, Tone and Level use </w:t>
       </w:r>
       <w:r>
         <w:rPr>
           <w:b/>
         </w:rPr>
-        <w:t xml:space="preserve">digital potentiometers</w:t>
-      </w:r>
-      <w:r>
-        <w:t xml:space="preserve">: chips that act as variable resistors, set by a small microcontroller in the pedal. The open design choice is what happens to the physical knobs:</w:t>
-      </w:r>
-    </w:p>
-    <w:tbl>
-      <w:tblPr>
-        <w:tblW w:w="9360" w:type="dxa"/>
-        <w:tblBorders>
-          <w:top w:val="single" w:sz="4" w:space="0" w:color="A0A0A0"/>
-          <w:left w:val="single" w:sz="4" w:space="0" w:color="A0A0A0"/>
-          <w:bottom w:val="single" w:sz="4" w:space="0" w:color="A0A0A0"/>
-          <w:right w:val="single" w:sz="4" w:space="0" w:color="A0A0A0"/>
-          <w:insideH w:val="single" w:sz="4" w:space="0" w:color="A0A0A0"/>
-          <w:insideV w:val="single" w:sz="4" w:space="0" w:color="A0A0A0"/>
-        </w:tblBorders>
-        <w:tblLayout w:type="fixed"/>
-        <w:tblCellMar>
-          <w:top w:w="40" w:type="dxa"/>
-          <w:left w:w="100" w:type="dxa"/>
-          <w:bottom w:w="40" w:type="dxa"/>
-          <w:right w:w="100" w:type="dxa"/>
-        </w:tblCellMar>
-      </w:tblPr>
-      <w:tblGrid>
-        <w:gridCol w:w="2400"/>
-        <w:gridCol w:w="4160"/>
-        <w:gridCol w:w="2800"/>
-      </w:tblGrid>
-      <w:tr>
-        <w:trPr>
-          <w:cantSplit/>
-          <w:tblHeader/>
-        </w:trPr>
-        <w:tc>
-          <w:tcPr>
-            <w:tcW w:w="2400" w:type="dxa"/>
-            <w:shd w:val="clear" w:color="auto" w:fill="E7E6E6"/>
-          </w:tcPr>
-          <w:p>
-            <w:pPr>
-              <w:spacing w:before="0" w:after="0"/>
-            </w:pPr>
-            <w:r>
-              <w:rPr>
-                <w:b/>
-              </w:rPr>
-              <w:t xml:space="preserve">Option</w:t>
-            </w:r>
-          </w:p>
-        </w:tc>
-        <w:tc>
-          <w:tcPr>
-            <w:tcW w:w="4160" w:type="dxa"/>
-            <w:shd w:val="clear" w:color="auto" w:fill="E7E6E6"/>
-          </w:tcPr>
-          <w:p>
-            <w:pPr>
-              <w:spacing w:before="0" w:after="0"/>
-            </w:pPr>
-            <w:r>
-              <w:rPr>
-                <w:b/>
-              </w:rPr>
-              <w:t xml:space="preserve">How it works</w:t>
-            </w:r>
-          </w:p>
-        </w:tc>
-        <w:tc>
-          <w:tcPr>
-            <w:tcW w:w="2800" w:type="dxa"/>
-            <w:shd w:val="clear" w:color="auto" w:fill="E7E6E6"/>
-          </w:tcPr>
-          <w:p>
-            <w:pPr>
-              <w:spacing w:before="0" w:after="0"/>
-            </w:pPr>
-            <w:r>
-              <w:rPr>
-                <w:b/>
-              </w:rPr>
-              <w:t xml:space="preserve">Trade-offs</w:t>
-            </w:r>
-          </w:p>
-        </w:tc>
-      </w:tr>
-      <w:tr>
-        <w:trPr>
-          <w:cantSplit/>
-        </w:trPr>
-        <w:tc>
-          <w:tcPr>
-            <w:tcW w:w="2400" w:type="dxa"/>
-          </w:tcPr>
-          <w:p>
-            <w:pPr>
-              <w:spacing w:before="0" w:after="0"/>
-            </w:pPr>
-            <w:r>
-              <w:t xml:space="preserve">A. Knobs as sensors (recommended for the first prototype)</w:t>
-            </w:r>
-          </w:p>
-        </w:tc>
-        <w:tc>
-          <w:tcPr>
-            <w:tcW w:w="4160" w:type="dxa"/>
-          </w:tcPr>
-          <w:p>
-            <w:pPr>
-              <w:spacing w:before="0" w:after="0"/>
-            </w:pPr>
-            <w:r>
-              <w:t xml:space="preserve">The audio always goes through digital pots. The physical knobs are read by the microcontroller, which sets the digital pots to match. When Switchyard loads a setting, the knobs stop controlling the sound until the player turns one past the current value, then it takes over again</w:t>
-            </w:r>
-          </w:p>
-        </w:tc>
-        <w:tc>
-          <w:tcPr>
-            <w:tcW w:w="2800" w:type="dxa"/>
-          </w:tcPr>
-          <w:p>
-            <w:pPr>
-              <w:spacing w:before="0" w:after="0"/>
-            </w:pPr>
-            <w:r>
-              <w:t xml:space="preserve">One audio path; simplest and cheapest. Knob pointers won’t match the sound after a remote change</w:t>
-            </w:r>
-          </w:p>
-        </w:tc>
-      </w:tr>
-      <w:tr>
-        <w:trPr>
-          <w:cantSplit/>
-        </w:trPr>
-        <w:tc>
-          <w:tcPr>
-            <w:tcW w:w="2400" w:type="dxa"/>
-          </w:tcPr>
-          <w:p>
-            <w:pPr>
-              <w:spacing w:before="0" w:after="0"/>
-            </w:pPr>
-            <w:r>
-              <w:t xml:space="preserve">B. Endless knobs with LED rings</w:t>
-            </w:r>
-          </w:p>
-        </w:tc>
-        <w:tc>
-          <w:tcPr>
-            <w:tcW w:w="4160" w:type="dxa"/>
-          </w:tcPr>
-          <w:p>
-            <w:pPr>
-              <w:spacing w:before="0" w:after="0"/>
-            </w:pPr>
-            <w:r>
-              <w:t xml:space="preserve">Knobs turn freely with no end stops; a ring of LEDs shows the actual setting</w:t>
-            </w:r>
-          </w:p>
-        </w:tc>
-        <w:tc>
-          <w:tcPr>
-            <w:tcW w:w="2800" w:type="dxa"/>
-          </w:tcPr>
-          <w:p>
-            <w:pPr>
-              <w:spacing w:before="0" w:after="0"/>
-            </w:pPr>
-            <w:r>
-              <w:t xml:space="preserve">Always accurate. Costs more, and looks less like a classic pedal</w:t>
-            </w:r>
-          </w:p>
-        </w:tc>
-      </w:tr>
-      <w:tr>
-        <w:trPr>
-          <w:cantSplit/>
-        </w:trPr>
-        <w:tc>
-          <w:tcPr>
-            <w:tcW w:w="2400" w:type="dxa"/>
-          </w:tcPr>
-          <w:p>
-            <w:pPr>
-              <w:spacing w:before="0" w:after="0"/>
-            </w:pPr>
-            <w:r>
-              <w:t xml:space="preserve">C. Real pots on their own, digital pots when linked</w:t>
-            </w:r>
-          </w:p>
-        </w:tc>
-        <w:tc>
-          <w:tcPr>
-            <w:tcW w:w="4160" w:type="dxa"/>
-          </w:tcPr>
-          <w:p>
-            <w:pPr>
-              <w:spacing w:before="0" w:after="0"/>
-            </w:pPr>
-            <w:r>
-              <w:t xml:space="preserve">Relays switch the audio between the physical pots (standalone) and the digital pots (linked)</w:t>
-            </w:r>
-          </w:p>
-        </w:tc>
-        <w:tc>
-          <w:tcPr>
-            <w:tcW w:w="2800" w:type="dxa"/>
-          </w:tcPr>
-          <w:p>
-            <w:pPr>
-              <w:spacing w:before="0" w:after="0"/>
-            </w:pPr>
-            <w:r>
-              <w:t xml:space="preserve">Standalone mode is pure analog with real pots, which some players care about. Doubles the knob parts and adds switching</w:t>
-            </w:r>
-          </w:p>
-        </w:tc>
-      </w:tr>
-    </w:tbl>
-    <w:p/>
+        <w:t xml:space="preserve">endless knobs with LED rings</w:t>
+      </w:r>
+      <w:r>
+        <w:t xml:space="preserve">. Each knob turns freely in both directions with no end stops, and a ring of small LEDs around it shows the actual setting. This means the knobs are always accurate, whether a setting was changed by hand or by Switchyard.</w:t>
+      </w:r>
+    </w:p>
+    <w:p>
+      <w:pPr>
+        <w:pStyle w:val="ListParagraph"/>
+        <w:numPr>
+          <w:ilvl w:val="0"/>
+          <w:numId w:val="90"/>
+        </w:numPr>
+      </w:pPr>
+      <w:r>
+        <w:rPr>
+          <w:b/>
+        </w:rPr>
+        <w:t xml:space="preserve">Turning a knob by hand:</w:t>
+      </w:r>
+      <w:r>
+        <w:t xml:space="preserve"> the microcontroller reads the knob (a part called a rotary encoder) and adjusts the setting up or down. The LED ring follows.</w:t>
+      </w:r>
+    </w:p>
+    <w:p>
+      <w:pPr>
+        <w:pStyle w:val="ListParagraph"/>
+        <w:numPr>
+          <w:ilvl w:val="0"/>
+          <w:numId w:val="90"/>
+        </w:numPr>
+      </w:pPr>
+      <w:r>
+        <w:rPr>
+          <w:b/>
+        </w:rPr>
+        <w:t xml:space="preserve">Switchyard changes a setting:</w:t>
+      </w:r>
+      <w:r>
+        <w:t xml:space="preserve"> the microcontroller sets the new value and the LED ring jumps to show it. Nothing physical has to move, and the next turn of the knob carries on from the new value.</w:t>
+      </w:r>
+    </w:p>
+    <w:p>
+      <w:pPr>
+        <w:pStyle w:val="ListParagraph"/>
+        <w:numPr>
+          <w:ilvl w:val="0"/>
+          <w:numId w:val="90"/>
+        </w:numPr>
+      </w:pPr>
+      <w:r>
+        <w:rPr>
+          <w:b/>
+        </w:rPr>
+        <w:t xml:space="preserve">Power off and on:</w:t>
+      </w:r>
+      <w:r>
+        <w:t xml:space="preserve"> the pedal remembers its last settings and starts up exactly as it was left. That’s important for standalone use, since an endless knob has no position to read at power-up.</w:t>
+      </w:r>
+    </w:p>
+    <w:p>
+      <w:pPr>
+        <w:pStyle w:val="ListParagraph"/>
+        <w:numPr>
+          <w:ilvl w:val="0"/>
+          <w:numId w:val="90"/>
+        </w:numPr>
+      </w:pPr>
+      <w:r>
+        <w:rPr>
+          <w:b/>
+        </w:rPr>
+        <w:t xml:space="preserve">In the audio circuit,</w:t>
+      </w:r>
+      <w:r>
+        <w:t xml:space="preserve"> each knob’s setting is applied by a digital potentiometer: a chip that acts as a variable resistor, set by the microcontroller.</w:t>
+      </w:r>
+    </w:p>
+    <w:p>
+      <w:pPr>
+        <w:pStyle w:val="ListParagraph"/>
+        <w:numPr>
+          <w:ilvl w:val="0"/>
+          <w:numId w:val="90"/>
+        </w:numPr>
+      </w:pPr>
+      <w:r>
+        <w:rPr>
+          <w:b/>
+        </w:rPr>
+        <w:t xml:space="preserve">LED ring details</w:t>
+      </w:r>
+      <w:r>
+        <w:t xml:space="preserve"> (number of LEDs, color, brightness for dark stages, and whether pressing the knob resets it to a default) are to be decided on the prototype.</w:t>
+      </w:r>
+    </w:p>
     <w:p>
       <w:r>
         <w:rPr>
@@ -1383,6 +1752,68 @@
               <w:spacing w:before="0" w:after="0"/>
             </w:pPr>
             <w:r>
+              <w:t xml:space="preserve">Knobs</w:t>
+            </w:r>
+          </w:p>
+        </w:tc>
+        <w:tc>
+          <w:tcPr>
+            <w:tcW w:w="7360" w:type="dxa"/>
+          </w:tcPr>
+          <w:p>
+            <w:pPr>
+              <w:spacing w:before="0" w:after="0"/>
+            </w:pPr>
+            <w:r>
+              <w:t xml:space="preserve">Three endless rotary encoders, each with an LED ring driven by an LED driver chip</w:t>
+            </w:r>
+          </w:p>
+        </w:tc>
+      </w:tr>
+      <w:tr>
+        <w:trPr>
+          <w:cantSplit/>
+        </w:trPr>
+        <w:tc>
+          <w:tcPr>
+            <w:tcW w:w="2000" w:type="dxa"/>
+          </w:tcPr>
+          <w:p>
+            <w:pPr>
+              <w:spacing w:before="0" w:after="0"/>
+            </w:pPr>
+            <w:r>
+              <w:t xml:space="preserve">Soft / Hard switch</w:t>
+            </w:r>
+          </w:p>
+        </w:tc>
+        <w:tc>
+          <w:tcPr>
+            <w:tcW w:w="7360" w:type="dxa"/>
+          </w:tcPr>
+          <w:p>
+            <w:pPr>
+              <w:spacing w:before="0" w:after="0"/>
+            </w:pPr>
+            <w:r>
+              <w:t xml:space="preserve">Mini toggle switch read by the microcontroller, plus a relay or electronic switch to select the diode pair, and two indicator LEDs</w:t>
+            </w:r>
+          </w:p>
+        </w:tc>
+      </w:tr>
+      <w:tr>
+        <w:trPr>
+          <w:cantSplit/>
+        </w:trPr>
+        <w:tc>
+          <w:tcPr>
+            <w:tcW w:w="2000" w:type="dxa"/>
+          </w:tcPr>
+          <w:p>
+            <w:pPr>
+              <w:spacing w:before="0" w:after="0"/>
+            </w:pPr>
+            <w:r>
               <w:t xml:space="preserve">Microcontroller</w:t>
             </w:r>
           </w:p>
@@ -1396,7 +1827,7 @@
               <w:spacing w:before="0" w:after="0"/>
             </w:pPr>
             <w:r>
-              <w:t xml:space="preserve">Small and low-cost (e.g. RP2040 or similar). Reads the knobs and footswitch, receives MIDI, sets the digital pots and bypass relay</w:t>
+              <w:t xml:space="preserve">Small and low-cost (e.g. RP2040 or similar). Reads the knobs, toggle and footswitch, drives the LED rings, receives MIDI, sets the digital pots, diode switching and bypass relay, and stores settings</w:t>
             </w:r>
           </w:p>
         </w:tc>
@@ -1427,7 +1858,7 @@
               <w:spacing w:before="0" w:after="0"/>
             </w:pPr>
             <w:r>
-              <w:t xml:space="preserve">Standard 125B size, to fit three knobs, five jacks and the extra circuitry. A 1590B may be too tight</w:t>
+              <w:t xml:space="preserve">Larger than a typical single pedal to fit three LED rings, the toggle and five jacks. Likely a 1590BB-size box (about 120 × 94 mm)</w:t>
             </w:r>
           </w:p>
         </w:tc>
@@ -1458,7 +1889,7 @@
               <w:spacing w:before="0" w:after="0"/>
             </w:pPr>
             <w:r>
-              <w:t xml:space="preserve">Estimated 30–60 mA at 9V, to be measured on the prototype</w:t>
+              <w:t xml:space="preserve">Estimated 50–100 mA at 9V including the LED rings, to be measured on the prototype</w:t>
             </w:r>
           </w:p>
         </w:tc>
@@ -1611,7 +2042,7 @@
               <w:spacing w:before="0" w:after="0"/>
             </w:pPr>
             <w:r>
-              <w:t xml:space="preserve">Knobs, pots used as sensors</w:t>
+              <w:t xml:space="preserve">Endless knobs (3 rotary encoders)</w:t>
             </w:r>
           </w:p>
         </w:tc>
@@ -1624,7 +2055,69 @@
               <w:spacing w:before="0" w:after="0"/>
             </w:pPr>
             <w:r>
-              <w:t xml:space="preserve">$3–5</w:t>
+              <w:t xml:space="preserve">$3–6</w:t>
+            </w:r>
+          </w:p>
+        </w:tc>
+      </w:tr>
+      <w:tr>
+        <w:trPr>
+          <w:cantSplit/>
+        </w:trPr>
+        <w:tc>
+          <w:tcPr>
+            <w:tcW w:w="7160" w:type="dxa"/>
+          </w:tcPr>
+          <w:p>
+            <w:pPr>
+              <w:spacing w:before="0" w:after="0"/>
+            </w:pPr>
+            <w:r>
+              <w:t xml:space="preserve">LED rings (LEDs and driver chip)</w:t>
+            </w:r>
+          </w:p>
+        </w:tc>
+        <w:tc>
+          <w:tcPr>
+            <w:tcW w:w="2200" w:type="dxa"/>
+          </w:tcPr>
+          <w:p>
+            <w:pPr>
+              <w:spacing w:before="0" w:after="0"/>
+            </w:pPr>
+            <w:r>
+              <w:t xml:space="preserve">$4–10</w:t>
+            </w:r>
+          </w:p>
+        </w:tc>
+      </w:tr>
+      <w:tr>
+        <w:trPr>
+          <w:cantSplit/>
+        </w:trPr>
+        <w:tc>
+          <w:tcPr>
+            <w:tcW w:w="7160" w:type="dxa"/>
+          </w:tcPr>
+          <w:p>
+            <w:pPr>
+              <w:spacing w:before="0" w:after="0"/>
+            </w:pPr>
+            <w:r>
+              <w:t xml:space="preserve">Soft/Hard toggle, both diode pairs, switching and indicator LEDs</w:t>
+            </w:r>
+          </w:p>
+        </w:tc>
+        <w:tc>
+          <w:tcPr>
+            <w:tcW w:w="2200" w:type="dxa"/>
+          </w:tcPr>
+          <w:p>
+            <w:pPr>
+              <w:spacing w:before="0" w:after="0"/>
+            </w:pPr>
+            <w:r>
+              <w:t xml:space="preserve">$2–4</w:t>
             </w:r>
           </w:p>
         </w:tc>
@@ -1816,7 +2309,7 @@
               <w:rPr>
                 <w:b/>
               </w:rPr>
-              <w:t xml:space="preserve">about $31–62</w:t>
+              <w:t xml:space="preserve">about $37–77</w:t>
             </w:r>
           </w:p>
         </w:tc>
@@ -1901,7 +2394,7 @@
         </w:numPr>
       </w:pPr>
       <w:r>
-        <w:t xml:space="preserve">Simulate the scaled-down gain stage needed for 100k digital pots.</w:t>
+        <w:t xml:space="preserve">Simulate both diode types and measure the volume difference between Soft and Hard.</w:t>
       </w:r>
     </w:p>
     <w:p>
@@ -1913,7 +2406,7 @@
         </w:numPr>
       </w:pPr>
       <w:r>
-        <w:t xml:space="preserve">Breadboard the analog circuit, then add a digital pot and microcontroller and control the gain from a MIDI source.</w:t>
+        <w:t xml:space="preserve">Simulate the scaled-down gain stage needed for 100k digital pots.</w:t>
       </w:r>
     </w:p>
     <w:p>
@@ -1925,15 +2418,7 @@
         </w:numPr>
       </w:pPr>
       <w:r>
-        <w:t xml:space="preserve">Update the KiCad schematic once the circuit is settled.</w:t>
-      </w:r>
-    </w:p>
-    <w:p>
-      <w:pPr>
-        <w:pStyle w:val="Heading1"/>
-      </w:pPr>
-      <w:r>
-        <w:t xml:space="preserve">Open questions</w:t>
+        <w:t xml:space="preserve">Breadboard the analog circuit, then add a digital pot, an endless knob with an LED ring and a microcontroller, and control the gain both by hand and from a MIDI source.</w:t>
       </w:r>
     </w:p>
     <w:p>
@@ -1945,7 +2430,15 @@
         </w:numPr>
       </w:pPr>
       <w:r>
-        <w:t xml:space="preserve">Which knob option (A, B or C above)?</w:t>
+        <w:t xml:space="preserve">Update the KiCad schematic once the circuit is settled.</w:t>
+      </w:r>
+    </w:p>
+    <w:p>
+      <w:pPr>
+        <w:pStyle w:val="Heading1"/>
+      </w:pPr>
+      <w:r>
+        <w:t xml:space="preserve">Open questions</w:t>
       </w:r>
     </w:p>
     <w:p>
@@ -1969,7 +2462,7 @@
         </w:numPr>
       </w:pPr>
       <w:r>
-        <w:t xml:space="preserve">Germanium diodes only, or a clipping-type switch?</w:t>
+        <w:t xml:space="preserve">Should the pedal store its own presets, so other brands’ MIDI controllers can recall them with simple “program change” messages?</w:t>
       </w:r>
     </w:p>
     <w:p>
@@ -1981,7 +2474,7 @@
         </w:numPr>
       </w:pPr>
       <w:r>
-        <w:t xml:space="preserve">Should the pedal store its own presets, so other brands’ MIDI controllers can recall them with simple “program change” messages?</w:t>
+        <w:t xml:space="preserve">Final MIDI mapping shared across all Linework pedals.</w:t>
       </w:r>
     </w:p>
     <w:p>
@@ -1993,7 +2486,19 @@
         </w:numPr>
       </w:pPr>
       <w:r>
-        <w:t xml:space="preserve">Final MIDI mapping shared across all Linework pedals.</w:t>
+        <w:t xml:space="preserve">How the MIDI channel is set.</w:t>
+      </w:r>
+    </w:p>
+    <w:p>
+      <w:pPr>
+        <w:pStyle w:val="ListParagraph"/>
+        <w:numPr>
+          <w:ilvl w:val="0"/>
+          <w:numId w:val="90"/>
+        </w:numPr>
+      </w:pPr>
+      <w:r>
+        <w:t xml:space="preserve">Soft/Hard as a toggle (lever can disagree with the active mode after a remote change) or as a push button with the two LEDs?</w:t>
       </w:r>
     </w:p>
     <w:sectPr>

</xml_diff>

<commit_message>
Add Flashover LTspice simulations and record results
New shared circuit plus listen, compare and tone run files: GS1 gain
stage scaled for 100k digital pots, Soft/Hard clipping, DS-1-style tone
with a 10k pot, x4 output amplifier and digital-pot Level, with the
post-gain section centered on a buffered 4.5V reference. Results are
recorded in the sim README and the Flashover product document.

Co-Authored-By: Claude Opus 5.5 <noreply@anthropic.com>
</commit_message>
<xml_diff>
--- a/pedals/distortion/Flashover Product Document.docx
+++ b/pedals/distortion/Flashover Product Document.docx
@@ -200,7 +200,7 @@
               <w:spacing w:before="0" w:after="0"/>
             </w:pPr>
             <w:r>
-              <w:t xml:space="preserve">pedals/distortion/ (KiCad project and LTspice simulation, currently named GS1)</w:t>
+              <w:t xml:space="preserve">pedals/distortion/ — KiCad project (currently named GS1) and LTspice simulations (sim/Flashover_*.cir)</w:t>
             </w:r>
           </w:p>
         </w:tc>
@@ -681,7 +681,61 @@
         <w:t xml:space="preserve">Tone control (new):</w:t>
       </w:r>
       <w:r>
-        <w:t xml:space="preserve"> a DS-1-style tone network after the clipping diodes, followed by a small buffer stage so the tone network doesn’t affect the volume and output. Component values are to be worked out in the LTspice simulation.</w:t>
+        <w:t xml:space="preserve"> a DS-1-style tone network after the clipping diodes: a low-pass filter (6.8k and 100n, about 234 Hz) and a high-pass filter (22n and 6.8k, about 1.06 kHz), blended by a 10k Tone pot.</w:t>
+      </w:r>
+    </w:p>
+    <w:p>
+      <w:pPr>
+        <w:pStyle w:val="ListParagraph"/>
+        <w:numPr>
+          <w:ilvl w:val="0"/>
+          <w:numId w:val="90"/>
+        </w:numPr>
+      </w:pPr>
+      <w:r>
+        <w:rPr>
+          <w:b/>
+        </w:rPr>
+        <w:t xml:space="preserve">Output amplifier (new):</w:t>
+      </w:r>
+      <w:r>
+        <w:t xml:space="preserve"> after the tone network, with a gain of 4 (+12 dB). It makes up the volume the tone network loses, so the pedal can play louder than the bypassed guitar, and keeps the Level pot from loading the tone network.</w:t>
+      </w:r>
+    </w:p>
+    <w:p>
+      <w:pPr>
+        <w:pStyle w:val="ListParagraph"/>
+        <w:numPr>
+          <w:ilvl w:val="0"/>
+          <w:numId w:val="90"/>
+        </w:numPr>
+      </w:pPr>
+      <w:r>
+        <w:rPr>
+          <w:b/>
+        </w:rPr>
+        <w:t xml:space="preserve">Centered on 4.5V:</w:t>
+      </w:r>
+      <w:r>
+        <w:t xml:space="preserve"> digital pots only accept signals between 0V and 9V, so everything after the gain stage is centered on the pedal’s 4.5V reference instead of ground. A small buffer amplifier keeps that reference steady.</w:t>
+      </w:r>
+    </w:p>
+    <w:p>
+      <w:pPr>
+        <w:pStyle w:val="ListParagraph"/>
+        <w:numPr>
+          <w:ilvl w:val="0"/>
+          <w:numId w:val="90"/>
+        </w:numPr>
+      </w:pPr>
+      <w:r>
+        <w:rPr>
+          <w:b/>
+        </w:rPr>
+        <w:t xml:space="preserve">Op-amps:</w:t>
+      </w:r>
+      <w:r>
+        <w:t xml:space="preserve"> the circuit uses three (gain stage, output amplifier and 4.5V buffer). In hardware this could be a 741 for the gain stage plus a dual op-amp, or one quad op-amp. To be chosen at the schematic stage.</w:t>
       </w:r>
     </w:p>
     <w:p>
@@ -901,7 +955,7 @@
         <w:t xml:space="preserve">Volume difference:</w:t>
       </w:r>
       <w:r>
-        <w:t xml:space="preserve"> silicon diodes let the signal get louder before clipping, so Hard mode is noticeably louder. The microcontroller can adjust the output level automatically when the mode changes, so the volume stays even. The amount is to be set from the simulation.</w:t>
+        <w:t xml:space="preserve"> silicon diodes let the signal get louder before clipping, so Hard mode is about 8.5 dB louder at full Gain. The microcontroller compensates automatically by reducing the Level setting to about 38% of its value in Hard mode, which the simulation shows matches the loudness to within 0.1 dB.</w:t>
       </w:r>
     </w:p>
     <w:p>
@@ -1024,7 +1078,7 @@
         <w:t xml:space="preserve">Circuit note:</w:t>
       </w:r>
       <w:r>
-        <w:t xml:space="preserve"> digital pots that work at 9V only go up to about 100k, but the Distortion+ gain knob is 1M. Scaling the gain-stage resistors down by ten (1M to 100k, 4.7k to 470 ohms) keeps the same gain range, about 2× to over 200×, and the capacitor in that leg scales up by ten to keep the same bass response. This change needs to be checked in the LTspice simulation.</w:t>
+        <w:t xml:space="preserve"> digital pots that work at 9V only go up to about 100k, but the Distortion+ gain knob is 1M. The gain stage is scaled down by ten: 1M to 100k, 4.7k to 390 ohms (slightly less than 470 to allow for the digital pot’s own resistance of about 75 ohms), and the capacitor in that leg up from 47n to 470n to keep the same bass response. The simulation confirms the gain range is unchanged: about 1.8× to 172× at 1 kHz.</w:t>
       </w:r>
     </w:p>
     <w:p>
@@ -2540,6 +2594,275 @@
         <w:pStyle w:val="Heading1"/>
       </w:pPr>
       <w:r>
+        <w:t xml:space="preserve">Simulation results</w:t>
+      </w:r>
+    </w:p>
+    <w:p>
+      <w:r>
+        <w:t xml:space="preserve">The Flashover audio path is simulated in LTspice (pedals/distortion/sim/Flashover_*.cir, October 2026):</w:t>
+      </w:r>
+    </w:p>
+    <w:tbl>
+      <w:tblPr>
+        <w:tblW w:w="9360" w:type="dxa"/>
+        <w:tblBorders>
+          <w:top w:val="single" w:sz="4" w:space="0" w:color="A0A0A0"/>
+          <w:left w:val="single" w:sz="4" w:space="0" w:color="A0A0A0"/>
+          <w:bottom w:val="single" w:sz="4" w:space="0" w:color="A0A0A0"/>
+          <w:right w:val="single" w:sz="4" w:space="0" w:color="A0A0A0"/>
+          <w:insideH w:val="single" w:sz="4" w:space="0" w:color="A0A0A0"/>
+          <w:insideV w:val="single" w:sz="4" w:space="0" w:color="A0A0A0"/>
+        </w:tblBorders>
+        <w:tblLayout w:type="fixed"/>
+        <w:tblCellMar>
+          <w:top w:w="40" w:type="dxa"/>
+          <w:left w:w="100" w:type="dxa"/>
+          <w:bottom w:w="40" w:type="dxa"/>
+          <w:right w:w="100" w:type="dxa"/>
+        </w:tblCellMar>
+      </w:tblPr>
+      <w:tblGrid>
+        <w:gridCol w:w="2600"/>
+        <w:gridCol w:w="6760"/>
+      </w:tblGrid>
+      <w:tr>
+        <w:trPr>
+          <w:cantSplit/>
+          <w:tblHeader/>
+        </w:trPr>
+        <w:tc>
+          <w:tcPr>
+            <w:tcW w:w="2600" w:type="dxa"/>
+            <w:shd w:val="clear" w:color="auto" w:fill="E7E6E6"/>
+          </w:tcPr>
+          <w:p>
+            <w:pPr>
+              <w:spacing w:before="0" w:after="0"/>
+            </w:pPr>
+            <w:r>
+              <w:rPr>
+                <w:b/>
+              </w:rPr>
+              <w:t xml:space="preserve">Check</w:t>
+            </w:r>
+          </w:p>
+        </w:tc>
+        <w:tc>
+          <w:tcPr>
+            <w:tcW w:w="6760" w:type="dxa"/>
+            <w:shd w:val="clear" w:color="auto" w:fill="E7E6E6"/>
+          </w:tcPr>
+          <w:p>
+            <w:pPr>
+              <w:spacing w:before="0" w:after="0"/>
+            </w:pPr>
+            <w:r>
+              <w:rPr>
+                <w:b/>
+              </w:rPr>
+              <w:t xml:space="preserve">Result</w:t>
+            </w:r>
+          </w:p>
+        </w:tc>
+      </w:tr>
+      <w:tr>
+        <w:trPr>
+          <w:cantSplit/>
+        </w:trPr>
+        <w:tc>
+          <w:tcPr>
+            <w:tcW w:w="2600" w:type="dxa"/>
+          </w:tcPr>
+          <w:p>
+            <w:pPr>
+              <w:spacing w:before="0" w:after="0"/>
+            </w:pPr>
+            <w:r>
+              <w:t xml:space="preserve">Digital pot voltages</w:t>
+            </w:r>
+          </w:p>
+        </w:tc>
+        <w:tc>
+          <w:tcPr>
+            <w:tcW w:w="6760" w:type="dxa"/>
+          </w:tcPr>
+          <w:p>
+            <w:pPr>
+              <w:spacing w:before="0" w:after="0"/>
+            </w:pPr>
+            <w:r>
+              <w:t xml:space="preserve">Every pot terminal stays between about 3.4V and 5.5V, inside the 0–9V limit</w:t>
+            </w:r>
+          </w:p>
+        </w:tc>
+      </w:tr>
+      <w:tr>
+        <w:trPr>
+          <w:cantSplit/>
+        </w:trPr>
+        <w:tc>
+          <w:tcPr>
+            <w:tcW w:w="2600" w:type="dxa"/>
+          </w:tcPr>
+          <w:p>
+            <w:pPr>
+              <w:spacing w:before="0" w:after="0"/>
+            </w:pPr>
+            <w:r>
+              <w:t xml:space="preserve">Gain range</w:t>
+            </w:r>
+          </w:p>
+        </w:tc>
+        <w:tc>
+          <w:tcPr>
+            <w:tcW w:w="6760" w:type="dxa"/>
+          </w:tcPr>
+          <w:p>
+            <w:pPr>
+              <w:spacing w:before="0" w:after="0"/>
+            </w:pPr>
+            <w:r>
+              <w:t xml:space="preserve">About 1.8× to 172× at 1 kHz, the same as GS1</w:t>
+            </w:r>
+          </w:p>
+        </w:tc>
+      </w:tr>
+      <w:tr>
+        <w:trPr>
+          <w:cantSplit/>
+        </w:trPr>
+        <w:tc>
+          <w:tcPr>
+            <w:tcW w:w="2600" w:type="dxa"/>
+          </w:tcPr>
+          <w:p>
+            <w:pPr>
+              <w:spacing w:before="0" w:after="0"/>
+            </w:pPr>
+            <w:r>
+              <w:t xml:space="preserve">Soft vs Hard loudness</w:t>
+            </w:r>
+          </w:p>
+        </w:tc>
+        <w:tc>
+          <w:tcPr>
+            <w:tcW w:w="6760" w:type="dxa"/>
+          </w:tcPr>
+          <w:p>
+            <w:pPr>
+              <w:spacing w:before="0" w:after="0"/>
+            </w:pPr>
+            <w:r>
+              <w:t xml:space="preserve">Hard is about 8.5 dB louder at full Gain (7.7 dB at half Gain). Level × 0.376 in Hard mode matches them within 0.1 dB</w:t>
+            </w:r>
+          </w:p>
+        </w:tc>
+      </w:tr>
+      <w:tr>
+        <w:trPr>
+          <w:cantSplit/>
+        </w:trPr>
+        <w:tc>
+          <w:tcPr>
+            <w:tcW w:w="2600" w:type="dxa"/>
+          </w:tcPr>
+          <w:p>
+            <w:pPr>
+              <w:spacing w:before="0" w:after="0"/>
+            </w:pPr>
+            <w:r>
+              <w:t xml:space="preserve">Output level</w:t>
+            </w:r>
+          </w:p>
+        </w:tc>
+        <w:tc>
+          <w:tcPr>
+            <w:tcW w:w="6760" w:type="dxa"/>
+          </w:tcPr>
+          <w:p>
+            <w:pPr>
+              <w:spacing w:before="0" w:after="0"/>
+            </w:pPr>
+            <w:r>
+              <w:t xml:space="preserve">At full Gain and Level: about +6 dB (Soft) and +14.5 dB (Hard) above the guitar signal</w:t>
+            </w:r>
+          </w:p>
+        </w:tc>
+      </w:tr>
+      <w:tr>
+        <w:trPr>
+          <w:cantSplit/>
+        </w:trPr>
+        <w:tc>
+          <w:tcPr>
+            <w:tcW w:w="2600" w:type="dxa"/>
+          </w:tcPr>
+          <w:p>
+            <w:pPr>
+              <w:spacing w:before="0" w:after="0"/>
+            </w:pPr>
+            <w:r>
+              <w:t xml:space="preserve">Tone pot value</w:t>
+            </w:r>
+          </w:p>
+        </w:tc>
+        <w:tc>
+          <w:tcPr>
+            <w:tcW w:w="6760" w:type="dxa"/>
+          </w:tcPr>
+          <w:p>
+            <w:pPr>
+              <w:spacing w:before="0" w:after="0"/>
+            </w:pPr>
+            <w:r>
+              <w:t xml:space="preserve">A 10k pot gives tone curves within about 3 dB of the DS-1’s 20k, so 10k is used (20k isn’t available as a 9V digital pot)</w:t>
+            </w:r>
+          </w:p>
+        </w:tc>
+      </w:tr>
+      <w:tr>
+        <w:trPr>
+          <w:cantSplit/>
+        </w:trPr>
+        <w:tc>
+          <w:tcPr>
+            <w:tcW w:w="2600" w:type="dxa"/>
+          </w:tcPr>
+          <w:p>
+            <w:pPr>
+              <w:spacing w:before="0" w:after="0"/>
+            </w:pPr>
+            <w:r>
+              <w:t xml:space="preserve">Tone range</w:t>
+            </w:r>
+          </w:p>
+        </w:tc>
+        <w:tc>
+          <w:tcPr>
+            <w:tcW w:w="6760" w:type="dxa"/>
+          </w:tcPr>
+          <w:p>
+            <w:pPr>
+              <w:spacing w:before="0" w:after="0"/>
+            </w:pPr>
+            <w:r>
+              <w:t xml:space="preserve">Dark boosts bass and cuts treble, the middle setting scoops the mids like a DS-1, and bright lifts the treble</w:t>
+            </w:r>
+          </w:p>
+        </w:tc>
+      </w:tr>
+    </w:tbl>
+    <w:p/>
+    <w:p>
+      <w:r>
+        <w:t xml:space="preserve">Listening files (Flashover_soft.wav and Flashover_hard.wav, matched in loudness) can be generated with Flashover_listen.cir.</w:t>
+      </w:r>
+    </w:p>
+    <w:p>
+      <w:pPr>
+        <w:pStyle w:val="Heading1"/>
+      </w:pPr>
+      <w:r>
         <w:t xml:space="preserve">Next steps</w:t>
       </w:r>
     </w:p>
@@ -2552,7 +2875,7 @@
         </w:numPr>
       </w:pPr>
       <w:r>
-        <w:t xml:space="preserve">Add the tone stage and buffer to the LTspice simulation and choose component values.</w:t>
+        <w:t xml:space="preserve">Listen to the simulated Soft and Hard sounds and adjust diode or tone values if needed.</w:t>
       </w:r>
     </w:p>
     <w:p>
@@ -2564,7 +2887,7 @@
         </w:numPr>
       </w:pPr>
       <w:r>
-        <w:t xml:space="preserve">Simulate both diode types and measure the volume difference between Soft and Hard.</w:t>
+        <w:t xml:space="preserve">Breadboard the analog circuit, then add a digital pot, an endless knob with an LED ring and a microcontroller, and control the gain both by hand and from a MIDI source.</w:t>
       </w:r>
     </w:p>
     <w:p>
@@ -2576,31 +2899,7 @@
         </w:numPr>
       </w:pPr>
       <w:r>
-        <w:t xml:space="preserve">Simulate the scaled-down gain stage needed for 100k digital pots.</w:t>
-      </w:r>
-    </w:p>
-    <w:p>
-      <w:pPr>
-        <w:pStyle w:val="ListParagraph"/>
-        <w:numPr>
-          <w:ilvl w:val="0"/>
-          <w:numId w:val="90"/>
-        </w:numPr>
-      </w:pPr>
-      <w:r>
-        <w:t xml:space="preserve">Breadboard the analog circuit, then add a digital pot, an endless knob with an LED ring and a microcontroller, and control the gain both by hand and from a MIDI source.</w:t>
-      </w:r>
-    </w:p>
-    <w:p>
-      <w:pPr>
-        <w:pStyle w:val="ListParagraph"/>
-        <w:numPr>
-          <w:ilvl w:val="0"/>
-          <w:numId w:val="90"/>
-        </w:numPr>
-      </w:pPr>
-      <w:r>
-        <w:t xml:space="preserve">Update the KiCad schematic once the circuit is settled.</w:t>
+        <w:t xml:space="preserve">Draw the Flashover schematic in KiCad as a new project, split across several pages, keeping GS1 as the original reference.</w:t>
       </w:r>
     </w:p>
     <w:p>

</xml_diff>

<commit_message>
Update Flashover product document to match the schematic
Record the chosen parts (RP2040, MCP45HV51 pots, PEC11R encoders,
IS31FL3236A with 11-LED rings, G6K-2 relays, H11L1 MIDI in, L7805 and
AP2112K regulators), the revised ~200 mA power estimate, a sheet-by-sheet
schematic summary, and the datasheet checks still to do.

Co-Authored-By: Claude Opus 5.5 <noreply@anthropic.com>
</commit_message>
<xml_diff>
--- a/pedals/distortion/Flashover Product Document.docx
+++ b/pedals/distortion/Flashover Product Document.docx
@@ -169,7 +169,7 @@
               <w:spacing w:before="0" w:after="0"/>
             </w:pPr>
             <w:r>
-              <w:t xml:space="preserve">Draft — basic definition, features still to be narrowed down</w:t>
+              <w:t xml:space="preserve">Draft — schematic drawn (version 0.1); breadboard prototype next</w:t>
             </w:r>
           </w:p>
         </w:tc>
@@ -200,7 +200,7 @@
               <w:spacing w:before="0" w:after="0"/>
             </w:pPr>
             <w:r>
-              <w:t xml:space="preserve">pedals/distortion/ — KiCad project (currently named GS1) and LTspice simulations (sim/Flashover_*.cir)</w:t>
+              <w:t xml:space="preserve">pedals/distortion/ — Flashover KiCad schematic (kicad/Flashover), the original GS1 design (kicad/GS1) and LTspice simulations (sim/Flashover_*.cir)</w:t>
             </w:r>
           </w:p>
         </w:tc>
@@ -619,7 +619,25 @@
               <w:spacing w:before="0" w:after="0"/>
             </w:pPr>
             <w:r>
-              <w:t xml:space="preserve">One LED shows when the effect is on. A second LED (or a color change) shows when the pedal is linked to Switchyard</w:t>
+              <w:t xml:space="preserve">An </w:t>
+            </w:r>
+            <w:r>
+              <w:rPr>
+                <w:b/>
+              </w:rPr>
+              <w:t xml:space="preserve">On</w:t>
+            </w:r>
+            <w:r>
+              <w:t xml:space="preserve"> LED by the footswitch shows when the effect is on. A </w:t>
+            </w:r>
+            <w:r>
+              <w:rPr>
+                <w:b/>
+              </w:rPr>
+              <w:t xml:space="preserve">Link</w:t>
+            </w:r>
+            <w:r>
+              <w:t xml:space="preserve"> LED shows when the pedal is linked to Switchyard</w:t>
             </w:r>
           </w:p>
         </w:tc>
@@ -663,7 +681,7 @@
         <w:t xml:space="preserve">Gain stage and clipping:</w:t>
       </w:r>
       <w:r>
-        <w:t xml:space="preserve"> taken from the existing GS1 design, a Distortion+-style circuit with one op-amp gain stage and a pair of clipping diodes (now switchable; see Soft / Hard clipping below). It’s already drawn in KiCad and simulated in LTspice.</w:t>
+        <w:t xml:space="preserve"> taken from the existing GS1 design, a Distortion+-style circuit with one op-amp gain stage and a pair of clipping diodes (now switchable; see Soft / Hard clipping below). It’s simulated in LTspice and drawn in the Flashover KiCad schematic.</w:t>
       </w:r>
     </w:p>
     <w:p>
@@ -735,7 +753,7 @@
         <w:t xml:space="preserve">Op-amps:</w:t>
       </w:r>
       <w:r>
-        <w:t xml:space="preserve"> the circuit uses three (gain stage, output amplifier and 4.5V buffer). In hardware this could be a 741 for the gain stage plus a dual op-amp, or one quad op-amp. To be chosen at the schematic stage.</w:t>
+        <w:t xml:space="preserve"> an LM741 for the gain stage, as in GS1, and a TL072 dual op-amp for the output amplifier and the 4.5V buffer.</w:t>
       </w:r>
     </w:p>
     <w:p>
@@ -937,7 +955,7 @@
         <w:t xml:space="preserve">How it switches:</w:t>
       </w:r>
       <w:r>
-        <w:t xml:space="preserve"> both pairs of diodes are on the board. Each press of the button switches to the other mode. The microcontroller connects one pair or the other using a small relay or electronic switch, and lights the matching LED. Switchyard can set the mode the same way, and the LEDs always show the real setting.</w:t>
+        <w:t xml:space="preserve"> both pairs of diodes are on the board. Each press of the button switches to the other mode. A small signal relay (Omron G6K-2), switched by the microcontroller, connects one pair or the other, and the matching LED lights. With the relay off the Soft pair is connected, so the pedal is in Soft until the microcontroller restores the saved mode at power-up. Switchyard can set the mode the same way, and the LEDs always show the real setting.</w:t>
       </w:r>
     </w:p>
     <w:p>
@@ -1049,7 +1067,7 @@
         <w:t xml:space="preserve">In the audio circuit,</w:t>
       </w:r>
       <w:r>
-        <w:t xml:space="preserve"> each knob’s setting is applied by a digital potentiometer: a chip that acts as a variable resistor, set by the microcontroller.</w:t>
+        <w:t xml:space="preserve"> each knob’s setting is applied by a digital potentiometer: a chip that acts as a variable resistor, set by the microcontroller. Flashover uses three Microchip MCP45HV51 chips (100k for Gain, 10k for Tone and Level), which handle the full 9V signal range.</w:t>
       </w:r>
     </w:p>
     <w:p>
@@ -1064,10 +1082,46 @@
         <w:rPr>
           <w:b/>
         </w:rPr>
-        <w:t xml:space="preserve">LED ring details</w:t>
-      </w:r>
-      <w:r>
-        <w:t xml:space="preserve"> (number of LEDs, color, brightness for dark stages, and whether pressing the knob resets it to a default) are to be decided on the prototype.</w:t>
+        <w:t xml:space="preserve">The knobs</w:t>
+      </w:r>
+      <w:r>
+        <w:t xml:space="preserve"> are rotary encoders with a push switch (Bourns PEC11R type, 24 steps per turn).</w:t>
+      </w:r>
+    </w:p>
+    <w:p>
+      <w:pPr>
+        <w:pStyle w:val="ListParagraph"/>
+        <w:numPr>
+          <w:ilvl w:val="0"/>
+          <w:numId w:val="90"/>
+        </w:numPr>
+      </w:pPr>
+      <w:r>
+        <w:rPr>
+          <w:b/>
+        </w:rPr>
+        <w:t xml:space="preserve">The LED rings</w:t>
+      </w:r>
+      <w:r>
+        <w:t xml:space="preserve"> have 11 LEDs each, from about 7 o’clock to 5 o’clock, with LED 6 at 12 o’clock so Tone’s middle position has its own LED. Gain and Level can show a bar and Tone a single dot. One LED driver chip (IS31FL3236A) runs all three rings plus the Soft, Hard and On LEDs, and can dim them for dark stages.</w:t>
+      </w:r>
+    </w:p>
+    <w:p>
+      <w:pPr>
+        <w:pStyle w:val="ListParagraph"/>
+        <w:numPr>
+          <w:ilvl w:val="0"/>
+          <w:numId w:val="90"/>
+        </w:numPr>
+      </w:pPr>
+      <w:r>
+        <w:rPr>
+          <w:b/>
+        </w:rPr>
+        <w:t xml:space="preserve">Still to decide on the prototype:</w:t>
+      </w:r>
+      <w:r>
+        <w:t xml:space="preserve"> LED color and brightness, and whether pressing a knob resets it to a default.</w:t>
       </w:r>
     </w:p>
     <w:p>
@@ -1927,7 +1981,7 @@
               <w:spacing w:before="0" w:after="0"/>
             </w:pPr>
             <w:r>
-              <w:t xml:space="preserve">Relay-based true bypass so the microcontroller (and Switchyard) can turn the effect on and off. With no power, the relay connects input straight to output</w:t>
+              <w:t xml:space="preserve">Relay true bypass (Omron G6K-2) so the microcontroller (and Switchyard) can turn the effect on and off. With the relay off, including when there is no power, the input jack connects straight to the output jack. The firmware turns Level down for a few milliseconds while the relay switches, to avoid clicks</w:t>
             </w:r>
           </w:p>
         </w:tc>
@@ -1989,7 +2043,7 @@
               <w:spacing w:before="0" w:after="0"/>
             </w:pPr>
             <w:r>
-              <w:t xml:space="preserve">Three endless rotary encoders, each with an LED ring driven by an LED driver chip</w:t>
+              <w:t xml:space="preserve">Three endless rotary encoders with push switches (Bourns PEC11R type), each with an 11-LED ring</w:t>
             </w:r>
           </w:p>
         </w:tc>
@@ -2007,6 +2061,68 @@
               <w:spacing w:before="0" w:after="0"/>
             </w:pPr>
             <w:r>
+              <w:t xml:space="preserve">Digital pots</w:t>
+            </w:r>
+          </w:p>
+        </w:tc>
+        <w:tc>
+          <w:tcPr>
+            <w:tcW w:w="7360" w:type="dxa"/>
+          </w:tcPr>
+          <w:p>
+            <w:pPr>
+              <w:spacing w:before="0" w:after="0"/>
+            </w:pPr>
+            <w:r>
+              <w:t xml:space="preserve">Three Microchip MCP45HV51 (I²C): 100k for Gain, 10k for Tone and Level</w:t>
+            </w:r>
+          </w:p>
+        </w:tc>
+      </w:tr>
+      <w:tr>
+        <w:trPr>
+          <w:cantSplit/>
+        </w:trPr>
+        <w:tc>
+          <w:tcPr>
+            <w:tcW w:w="2000" w:type="dxa"/>
+          </w:tcPr>
+          <w:p>
+            <w:pPr>
+              <w:spacing w:before="0" w:after="0"/>
+            </w:pPr>
+            <w:r>
+              <w:t xml:space="preserve">LED driver</w:t>
+            </w:r>
+          </w:p>
+        </w:tc>
+        <w:tc>
+          <w:tcPr>
+            <w:tcW w:w="7360" w:type="dxa"/>
+          </w:tcPr>
+          <w:p>
+            <w:pPr>
+              <w:spacing w:before="0" w:after="0"/>
+            </w:pPr>
+            <w:r>
+              <w:t xml:space="preserve">One IS31FL3236A (36 outputs): the three rings (33 LEDs) plus the Soft, Hard and On LEDs. It has its own I²C bus because its addresses may overlap the digital pots’</w:t>
+            </w:r>
+          </w:p>
+        </w:tc>
+      </w:tr>
+      <w:tr>
+        <w:trPr>
+          <w:cantSplit/>
+        </w:trPr>
+        <w:tc>
+          <w:tcPr>
+            <w:tcW w:w="2000" w:type="dxa"/>
+          </w:tcPr>
+          <w:p>
+            <w:pPr>
+              <w:spacing w:before="0" w:after="0"/>
+            </w:pPr>
+            <w:r>
               <w:t xml:space="preserve">Soft / Hard</w:t>
             </w:r>
           </w:p>
@@ -2020,7 +2136,7 @@
               <w:spacing w:before="0" w:after="0"/>
             </w:pPr>
             <w:r>
-              <w:t xml:space="preserve">Small push button, a relay or electronic switch to select the diode pair, and two LEDs labelled Soft and Hard</w:t>
+              <w:t xml:space="preserve">Push button, an Omron G6K-2 relay to select the diode pair, and two LEDs labelled Soft and Hard</w:t>
             </w:r>
           </w:p>
         </w:tc>
@@ -2051,7 +2167,7 @@
               <w:spacing w:before="0" w:after="0"/>
             </w:pPr>
             <w:r>
-              <w:t xml:space="preserve">Small and low-cost (e.g. RP2040 or similar), with memory for settings, 128 presets and two copies of the firmware. Reads the knobs, button and footswitch, drives the LEDs, handles MIDI, and sets the digital pots, diode switching and bypass relay</w:t>
+              <w:t xml:space="preserve">Raspberry Pi RP2040 with 2 MB of flash memory (two copies of the firmware, settings and 128 presets) and a 12 MHz crystal. Reads the knobs, button and footswitch, drives the LEDs, handles MIDI, and sets the digital pots, diode switching and bypass relay. A small programming header loads the first firmware; later updates come over MIDI. Nine pins are left spare</w:t>
             </w:r>
           </w:p>
         </w:tc>
@@ -2069,6 +2185,68 @@
               <w:spacing w:before="0" w:after="0"/>
             </w:pPr>
             <w:r>
+              <w:t xml:space="preserve">MIDI</w:t>
+            </w:r>
+          </w:p>
+        </w:tc>
+        <w:tc>
+          <w:tcPr>
+            <w:tcW w:w="7360" w:type="dxa"/>
+          </w:tcPr>
+          <w:p>
+            <w:pPr>
+              <w:spacing w:before="0" w:after="0"/>
+            </w:pPr>
+            <w:r>
+              <w:t xml:space="preserve">MIDI in through an H11L1 optocoupler, so pedals stay electrically separate. MIDI out uses the values in the MIDI Association’s 3.3V update</w:t>
+            </w:r>
+          </w:p>
+        </w:tc>
+      </w:tr>
+      <w:tr>
+        <w:trPr>
+          <w:cantSplit/>
+        </w:trPr>
+        <w:tc>
+          <w:tcPr>
+            <w:tcW w:w="2000" w:type="dxa"/>
+          </w:tcPr>
+          <w:p>
+            <w:pPr>
+              <w:spacing w:before="0" w:after="0"/>
+            </w:pPr>
+            <w:r>
+              <w:t xml:space="preserve">Power</w:t>
+            </w:r>
+          </w:p>
+        </w:tc>
+        <w:tc>
+          <w:tcPr>
+            <w:tcW w:w="7360" w:type="dxa"/>
+          </w:tcPr>
+          <w:p>
+            <w:pPr>
+              <w:spacing w:before="0" w:after="0"/>
+            </w:pPr>
+            <w:r>
+              <w:t xml:space="preserve">9V input with reverse-polarity protection, a buffered 4.5V reference for the audio circuit, an L7805 5V regulator (relays and LEDs) and an AP2112K 3.3V regulator (microcontroller and logic)</w:t>
+            </w:r>
+          </w:p>
+        </w:tc>
+      </w:tr>
+      <w:tr>
+        <w:trPr>
+          <w:cantSplit/>
+        </w:trPr>
+        <w:tc>
+          <w:tcPr>
+            <w:tcW w:w="2000" w:type="dxa"/>
+          </w:tcPr>
+          <w:p>
+            <w:pPr>
+              <w:spacing w:before="0" w:after="0"/>
+            </w:pPr>
+            <w:r>
               <w:t xml:space="preserve">Enclosure</w:t>
             </w:r>
           </w:p>
@@ -2113,13 +2291,406 @@
               <w:spacing w:before="0" w:after="0"/>
             </w:pPr>
             <w:r>
-              <w:t xml:space="preserve">Estimated 50–100 mA at 9V including the LED rings, to be measured on the prototype</w:t>
+              <w:t xml:space="preserve">Estimated up to about 200 mA at 9V with all LEDs lit (the LED rings are most of it), to be measured on the prototype. At that current the 5V regulator gets warm (about 0.8 W) and may need a small heatsink</w:t>
             </w:r>
           </w:p>
         </w:tc>
       </w:tr>
     </w:tbl>
     <w:p/>
+    <w:p>
+      <w:pPr>
+        <w:pStyle w:val="Heading1"/>
+      </w:pPr>
+      <w:r>
+        <w:t xml:space="preserve">Schematic</w:t>
+      </w:r>
+    </w:p>
+    <w:p>
+      <w:r>
+        <w:t xml:space="preserve">The Flashover schematic (version 0.1, October 2026) is a KiCad project in pedals/distortion/kicad/Flashover, split into ten sheets. The audio sheets match the LTspice model value for value.</w:t>
+      </w:r>
+    </w:p>
+    <w:tbl>
+      <w:tblPr>
+        <w:tblW w:w="9360" w:type="dxa"/>
+        <w:tblBorders>
+          <w:top w:val="single" w:sz="4" w:space="0" w:color="A0A0A0"/>
+          <w:left w:val="single" w:sz="4" w:space="0" w:color="A0A0A0"/>
+          <w:bottom w:val="single" w:sz="4" w:space="0" w:color="A0A0A0"/>
+          <w:right w:val="single" w:sz="4" w:space="0" w:color="A0A0A0"/>
+          <w:insideH w:val="single" w:sz="4" w:space="0" w:color="A0A0A0"/>
+          <w:insideV w:val="single" w:sz="4" w:space="0" w:color="A0A0A0"/>
+        </w:tblBorders>
+        <w:tblLayout w:type="fixed"/>
+        <w:tblCellMar>
+          <w:top w:w="40" w:type="dxa"/>
+          <w:left w:w="100" w:type="dxa"/>
+          <w:bottom w:w="40" w:type="dxa"/>
+          <w:right w:w="100" w:type="dxa"/>
+        </w:tblCellMar>
+      </w:tblPr>
+      <w:tblGrid>
+        <w:gridCol w:w="2400"/>
+        <w:gridCol w:w="6960"/>
+      </w:tblGrid>
+      <w:tr>
+        <w:trPr>
+          <w:cantSplit/>
+          <w:tblHeader/>
+        </w:trPr>
+        <w:tc>
+          <w:tcPr>
+            <w:tcW w:w="2400" w:type="dxa"/>
+            <w:shd w:val="clear" w:color="auto" w:fill="E7E6E6"/>
+          </w:tcPr>
+          <w:p>
+            <w:pPr>
+              <w:spacing w:before="0" w:after="0"/>
+            </w:pPr>
+            <w:r>
+              <w:rPr>
+                <w:b/>
+              </w:rPr>
+              <w:t xml:space="preserve">Sheet</w:t>
+            </w:r>
+          </w:p>
+        </w:tc>
+        <w:tc>
+          <w:tcPr>
+            <w:tcW w:w="6960" w:type="dxa"/>
+            <w:shd w:val="clear" w:color="auto" w:fill="E7E6E6"/>
+          </w:tcPr>
+          <w:p>
+            <w:pPr>
+              <w:spacing w:before="0" w:after="0"/>
+            </w:pPr>
+            <w:r>
+              <w:rPr>
+                <w:b/>
+              </w:rPr>
+              <w:t xml:space="preserve">Contents</w:t>
+            </w:r>
+          </w:p>
+        </w:tc>
+      </w:tr>
+      <w:tr>
+        <w:trPr>
+          <w:cantSplit/>
+        </w:trPr>
+        <w:tc>
+          <w:tcPr>
+            <w:tcW w:w="2400" w:type="dxa"/>
+          </w:tcPr>
+          <w:p>
+            <w:pPr>
+              <w:spacing w:before="0" w:after="0"/>
+            </w:pPr>
+            <w:r>
+              <w:t xml:space="preserve">Bypass</w:t>
+            </w:r>
+          </w:p>
+        </w:tc>
+        <w:tc>
+          <w:tcPr>
+            <w:tcW w:w="6960" w:type="dxa"/>
+          </w:tcPr>
+          <w:p>
+            <w:pPr>
+              <w:spacing w:before="0" w:after="0"/>
+            </w:pPr>
+            <w:r>
+              <w:t xml:space="preserve">Input and output jacks, bypass relay, footswitch, Link LED</w:t>
+            </w:r>
+          </w:p>
+        </w:tc>
+      </w:tr>
+      <w:tr>
+        <w:trPr>
+          <w:cantSplit/>
+        </w:trPr>
+        <w:tc>
+          <w:tcPr>
+            <w:tcW w:w="2400" w:type="dxa"/>
+          </w:tcPr>
+          <w:p>
+            <w:pPr>
+              <w:spacing w:before="0" w:after="0"/>
+            </w:pPr>
+            <w:r>
+              <w:t xml:space="preserve">Input and Gain</w:t>
+            </w:r>
+          </w:p>
+        </w:tc>
+        <w:tc>
+          <w:tcPr>
+            <w:tcW w:w="6960" w:type="dxa"/>
+          </w:tcPr>
+          <w:p>
+            <w:pPr>
+              <w:spacing w:before="0" w:after="0"/>
+            </w:pPr>
+            <w:r>
+              <w:t xml:space="preserve">Input network and the GS1 gain stage with the Gain digital pot</w:t>
+            </w:r>
+          </w:p>
+        </w:tc>
+      </w:tr>
+      <w:tr>
+        <w:trPr>
+          <w:cantSplit/>
+        </w:trPr>
+        <w:tc>
+          <w:tcPr>
+            <w:tcW w:w="2400" w:type="dxa"/>
+          </w:tcPr>
+          <w:p>
+            <w:pPr>
+              <w:spacing w:before="0" w:after="0"/>
+            </w:pPr>
+            <w:r>
+              <w:t xml:space="preserve">Clipping</w:t>
+            </w:r>
+          </w:p>
+        </w:tc>
+        <w:tc>
+          <w:tcPr>
+            <w:tcW w:w="6960" w:type="dxa"/>
+          </w:tcPr>
+          <w:p>
+            <w:pPr>
+              <w:spacing w:before="0" w:after="0"/>
+            </w:pPr>
+            <w:r>
+              <w:t xml:space="preserve">Soft (germanium) and Hard (silicon) diode pairs and their relay</w:t>
+            </w:r>
+          </w:p>
+        </w:tc>
+      </w:tr>
+      <w:tr>
+        <w:trPr>
+          <w:cantSplit/>
+        </w:trPr>
+        <w:tc>
+          <w:tcPr>
+            <w:tcW w:w="2400" w:type="dxa"/>
+          </w:tcPr>
+          <w:p>
+            <w:pPr>
+              <w:spacing w:before="0" w:after="0"/>
+            </w:pPr>
+            <w:r>
+              <w:t xml:space="preserve">Tone and Output</w:t>
+            </w:r>
+          </w:p>
+        </w:tc>
+        <w:tc>
+          <w:tcPr>
+            <w:tcW w:w="6960" w:type="dxa"/>
+          </w:tcPr>
+          <w:p>
+            <w:pPr>
+              <w:spacing w:before="0" w:after="0"/>
+            </w:pPr>
+            <w:r>
+              <w:t xml:space="preserve">DS-1 style tone control, ×4 output amplifier, Tone and Level digital pots</w:t>
+            </w:r>
+          </w:p>
+        </w:tc>
+      </w:tr>
+      <w:tr>
+        <w:trPr>
+          <w:cantSplit/>
+        </w:trPr>
+        <w:tc>
+          <w:tcPr>
+            <w:tcW w:w="2400" w:type="dxa"/>
+          </w:tcPr>
+          <w:p>
+            <w:pPr>
+              <w:spacing w:before="0" w:after="0"/>
+            </w:pPr>
+            <w:r>
+              <w:t xml:space="preserve">Power and Bias</w:t>
+            </w:r>
+          </w:p>
+        </w:tc>
+        <w:tc>
+          <w:tcPr>
+            <w:tcW w:w="6960" w:type="dxa"/>
+          </w:tcPr>
+          <w:p>
+            <w:pPr>
+              <w:spacing w:before="0" w:after="0"/>
+            </w:pPr>
+            <w:r>
+              <w:t xml:space="preserve">9V input, 4.5V reference, 5V regulator, op-amp power</w:t>
+            </w:r>
+          </w:p>
+        </w:tc>
+      </w:tr>
+      <w:tr>
+        <w:trPr>
+          <w:cantSplit/>
+        </w:trPr>
+        <w:tc>
+          <w:tcPr>
+            <w:tcW w:w="2400" w:type="dxa"/>
+          </w:tcPr>
+          <w:p>
+            <w:pPr>
+              <w:spacing w:before="0" w:after="0"/>
+            </w:pPr>
+            <w:r>
+              <w:t xml:space="preserve">Controller</w:t>
+            </w:r>
+          </w:p>
+        </w:tc>
+        <w:tc>
+          <w:tcPr>
+            <w:tcW w:w="6960" w:type="dxa"/>
+          </w:tcPr>
+          <w:p>
+            <w:pPr>
+              <w:spacing w:before="0" w:after="0"/>
+            </w:pPr>
+            <w:r>
+              <w:t xml:space="preserve">RP2040, 3.3V regulator, flash memory, crystal, programming header, pin plan</w:t>
+            </w:r>
+          </w:p>
+        </w:tc>
+      </w:tr>
+      <w:tr>
+        <w:trPr>
+          <w:cantSplit/>
+        </w:trPr>
+        <w:tc>
+          <w:tcPr>
+            <w:tcW w:w="2400" w:type="dxa"/>
+          </w:tcPr>
+          <w:p>
+            <w:pPr>
+              <w:spacing w:before="0" w:after="0"/>
+            </w:pPr>
+            <w:r>
+              <w:t xml:space="preserve">Digital Pots</w:t>
+            </w:r>
+          </w:p>
+        </w:tc>
+        <w:tc>
+          <w:tcPr>
+            <w:tcW w:w="6960" w:type="dxa"/>
+          </w:tcPr>
+          <w:p>
+            <w:pPr>
+              <w:spacing w:before="0" w:after="0"/>
+            </w:pPr>
+            <w:r>
+              <w:t xml:space="preserve">Control side of the three digital pots</w:t>
+            </w:r>
+          </w:p>
+        </w:tc>
+      </w:tr>
+      <w:tr>
+        <w:trPr>
+          <w:cantSplit/>
+        </w:trPr>
+        <w:tc>
+          <w:tcPr>
+            <w:tcW w:w="2400" w:type="dxa"/>
+          </w:tcPr>
+          <w:p>
+            <w:pPr>
+              <w:spacing w:before="0" w:after="0"/>
+            </w:pPr>
+            <w:r>
+              <w:t xml:space="preserve">Controls</w:t>
+            </w:r>
+          </w:p>
+        </w:tc>
+        <w:tc>
+          <w:tcPr>
+            <w:tcW w:w="6960" w:type="dxa"/>
+          </w:tcPr>
+          <w:p>
+            <w:pPr>
+              <w:spacing w:before="0" w:after="0"/>
+            </w:pPr>
+            <w:r>
+              <w:t xml:space="preserve">Three encoders and the Soft/Hard button</w:t>
+            </w:r>
+          </w:p>
+        </w:tc>
+      </w:tr>
+      <w:tr>
+        <w:trPr>
+          <w:cantSplit/>
+        </w:trPr>
+        <w:tc>
+          <w:tcPr>
+            <w:tcW w:w="2400" w:type="dxa"/>
+          </w:tcPr>
+          <w:p>
+            <w:pPr>
+              <w:spacing w:before="0" w:after="0"/>
+            </w:pPr>
+            <w:r>
+              <w:t xml:space="preserve">LED Rings</w:t>
+            </w:r>
+          </w:p>
+        </w:tc>
+        <w:tc>
+          <w:tcPr>
+            <w:tcW w:w="6960" w:type="dxa"/>
+          </w:tcPr>
+          <w:p>
+            <w:pPr>
+              <w:spacing w:before="0" w:after="0"/>
+            </w:pPr>
+            <w:r>
+              <w:t xml:space="preserve">LED driver, three 11-LED rings, Soft, Hard and On LEDs</w:t>
+            </w:r>
+          </w:p>
+        </w:tc>
+      </w:tr>
+      <w:tr>
+        <w:trPr>
+          <w:cantSplit/>
+        </w:trPr>
+        <w:tc>
+          <w:tcPr>
+            <w:tcW w:w="2400" w:type="dxa"/>
+          </w:tcPr>
+          <w:p>
+            <w:pPr>
+              <w:spacing w:before="0" w:after="0"/>
+            </w:pPr>
+            <w:r>
+              <w:t xml:space="preserve">MIDI</w:t>
+            </w:r>
+          </w:p>
+        </w:tc>
+        <w:tc>
+          <w:tcPr>
+            <w:tcW w:w="6960" w:type="dxa"/>
+          </w:tcPr>
+          <w:p>
+            <w:pPr>
+              <w:spacing w:before="0" w:after="0"/>
+            </w:pPr>
+            <w:r>
+              <w:t xml:space="preserve">MIDI in and MIDI out on 3.5 mm TRS jacks</w:t>
+            </w:r>
+          </w:p>
+        </w:tc>
+      </w:tr>
+    </w:tbl>
+    <w:p/>
+    <w:p>
+      <w:r>
+        <w:t xml:space="preserve">Before the board is laid out, a few values still need checking against their datasheets: the resistor that sets the LED current, the LED driver’s compatibility with 3.3V logic, the MIDI output resistor values and the relay coil polarity.</w:t>
+      </w:r>
+    </w:p>
     <w:p>
       <w:pPr>
         <w:pStyle w:val="Heading1"/>
@@ -2899,15 +3470,7 @@
         </w:numPr>
       </w:pPr>
       <w:r>
-        <w:t xml:space="preserve">Draw the Flashover schematic in KiCad as a new project, split across several pages, keeping GS1 as the original reference.</w:t>
-      </w:r>
-    </w:p>
-    <w:p>
-      <w:pPr>
-        <w:pStyle w:val="Heading1"/>
-      </w:pPr>
-      <w:r>
-        <w:t xml:space="preserve">Open questions</w:t>
+        <w:t xml:space="preserve">Check the datasheet values listed under Schematic above.</w:t>
       </w:r>
     </w:p>
     <w:p>
@@ -2919,7 +3482,39 @@
         </w:numPr>
       </w:pPr>
       <w:r>
-        <w:t xml:space="preserve">LED ring details: number of LEDs, color and brightness.</w:t>
+        <w:t xml:space="preserve">Assign footprints and lay out the circuit board.</w:t>
+      </w:r>
+    </w:p>
+    <w:p>
+      <w:pPr>
+        <w:pStyle w:val="Heading1"/>
+      </w:pPr>
+      <w:r>
+        <w:t xml:space="preserve">Open questions</w:t>
+      </w:r>
+    </w:p>
+    <w:p>
+      <w:pPr>
+        <w:pStyle w:val="ListParagraph"/>
+        <w:numPr>
+          <w:ilvl w:val="0"/>
+          <w:numId w:val="90"/>
+        </w:numPr>
+      </w:pPr>
+      <w:r>
+        <w:t xml:space="preserve">LED color and brightness.</w:t>
+      </w:r>
+    </w:p>
+    <w:p>
+      <w:pPr>
+        <w:pStyle w:val="ListParagraph"/>
+        <w:numPr>
+          <w:ilvl w:val="0"/>
+          <w:numId w:val="90"/>
+        </w:numPr>
+      </w:pPr>
+      <w:r>
+        <w:t xml:space="preserve">Whether a switching 5V regulator is needed instead of the L7805, once the prototype’s current draw is measured.</w:t>
       </w:r>
     </w:p>
     <w:p>

</xml_diff>

<commit_message>
Apply datasheet checks to Flashover
R33 = 15k (about 5 mA per LED, from the IS31FL3236A current formula).
R39 marked 33 ohm 0.5W per MIDI CA-033. R4 390 -> 330 because the
MCP45HV51 wiper resistance is about 150 ohms at 9V (below its 10V
specified range); sim model Rw updated to match. Pot symbol description
corrected to 8-bit. Product document records the check results.

Co-Authored-By: Claude Opus 5.5 <noreply@anthropic.com>
</commit_message>
<xml_diff>
--- a/pedals/distortion/Flashover Product Document.docx
+++ b/pedals/distortion/Flashover Product Document.docx
@@ -1132,7 +1132,7 @@
         <w:t xml:space="preserve">Circuit note:</w:t>
       </w:r>
       <w:r>
-        <w:t xml:space="preserve"> digital pots that work at 9V only go up to about 100k, but the Distortion+ gain knob is 1M. The gain stage is scaled down by ten: 1M to 100k, 4.7k to 390 ohms (slightly less than 470 to allow for the digital pot’s own resistance of about 75 ohms), and the capacitor in that leg up from 47n to 470n to keep the same bass response. The simulation confirms the gain range is unchanged: about 1.8× to 172× at 1 kHz.</w:t>
+        <w:t xml:space="preserve"> digital pots that work at 9V only go up to about 100k, but the Distortion+ gain knob is 1M. The gain stage is scaled down by ten: 1M to 100k, 4.7k to 330 ohms (less than 470 to allow for the digital pot’s own wiper resistance, about 150 ohms at 9V according to its datasheet), and the capacitor in that leg up from 47n to 470n to keep the same bass response. The gain range is unchanged: about 1.8× to 170× at 1 kHz.</w:t>
       </w:r>
     </w:p>
     <w:p>
@@ -2688,7 +2688,100 @@
     <w:p/>
     <w:p>
       <w:r>
-        <w:t xml:space="preserve">Before the board is laid out, a few values still need checking against their datasheets: the resistor that sets the LED current, the LED driver’s compatibility with 3.3V logic, the MIDI output resistor values and the relay coil polarity.</w:t>
+        <w:rPr>
+          <w:b/>
+        </w:rPr>
+        <w:t xml:space="preserve">Datasheet checks (October 2026):</w:t>
+      </w:r>
+    </w:p>
+    <w:p>
+      <w:pPr>
+        <w:pStyle w:val="ListParagraph"/>
+        <w:numPr>
+          <w:ilvl w:val="0"/>
+          <w:numId w:val="90"/>
+        </w:numPr>
+      </w:pPr>
+      <w:r>
+        <w:rPr>
+          <w:b/>
+        </w:rPr>
+        <w:t xml:space="preserve">LED current:</w:t>
+      </w:r>
+      <w:r>
+        <w:t xml:space="preserve"> the driver’s maximum current is 58.5 × 1.3V ÷ R33, so R33 = 15k gives about 5 mA per LED. The firmware can scale it down and dim with PWM.</w:t>
+      </w:r>
+    </w:p>
+    <w:p>
+      <w:pPr>
+        <w:pStyle w:val="ListParagraph"/>
+        <w:numPr>
+          <w:ilvl w:val="0"/>
+          <w:numId w:val="90"/>
+        </w:numPr>
+      </w:pPr>
+      <w:r>
+        <w:rPr>
+          <w:b/>
+        </w:rPr>
+        <w:t xml:space="preserve">LED driver logic:</w:t>
+      </w:r>
+      <w:r>
+        <w:t xml:space="preserve"> its inputs read anything above 1.4V as high, so 3.3V logic works while the chip runs from 5V. Its I²C addresses (0x3C–0x3F) are the same as the digital pots’, which confirms it needs its own bus.</w:t>
+      </w:r>
+    </w:p>
+    <w:p>
+      <w:pPr>
+        <w:pStyle w:val="ListParagraph"/>
+        <w:numPr>
+          <w:ilvl w:val="0"/>
+          <w:numId w:val="90"/>
+        </w:numPr>
+      </w:pPr>
+      <w:r>
+        <w:rPr>
+          <w:b/>
+        </w:rPr>
+        <w:t xml:space="preserve">MIDI out:</w:t>
+      </w:r>
+      <w:r>
+        <w:t xml:space="preserve"> 33 ohms on pin 4 and 10 ohms on pin 5 match the MIDI Association’s 3.3V update (CA-033). The 33 ohm resistor should be rated 0.5W.</w:t>
+      </w:r>
+    </w:p>
+    <w:p>
+      <w:pPr>
+        <w:pStyle w:val="ListParagraph"/>
+        <w:numPr>
+          <w:ilvl w:val="0"/>
+          <w:numId w:val="90"/>
+        </w:numPr>
+      </w:pPr>
+      <w:r>
+        <w:rPr>
+          <w:b/>
+        </w:rPr>
+        <w:t xml:space="preserve">Relay coil:</w:t>
+      </w:r>
+      <w:r>
+        <w:t xml:space="preserve"> the G6K is polarity-sensitive, with pin 1 positive. Both relays are wired that way.</w:t>
+      </w:r>
+    </w:p>
+    <w:p>
+      <w:pPr>
+        <w:pStyle w:val="ListParagraph"/>
+        <w:numPr>
+          <w:ilvl w:val="0"/>
+          <w:numId w:val="90"/>
+        </w:numPr>
+      </w:pPr>
+      <w:r>
+        <w:rPr>
+          <w:b/>
+        </w:rPr>
+        <w:t xml:space="preserve">Digital pots at 9V:</w:t>
+      </w:r>
+      <w:r>
+        <w:t xml:space="preserve"> the MCP45HV51’s analog side is specified from 10V, and Flashover runs it at about 8.6V. It still works there (it only resets below 6V), but its wiper resistance is about 150 ohms instead of 75. Only the Gain pot is sensitive to that, and R4 was reduced from 390 to 330 ohms to allow for it. To be confirmed on the breadboard.</w:t>
       </w:r>
     </w:p>
     <w:p>
@@ -3293,7 +3386,7 @@
               <w:spacing w:before="0" w:after="0"/>
             </w:pPr>
             <w:r>
-              <w:t xml:space="preserve">About 1.8× to 172× at 1 kHz, the same as GS1</w:t>
+              <w:t xml:space="preserve">About 1.8× to 172× at 1 kHz, the same as GS1 (simulated with a 75 ohm wiper; about 170× with the datasheet’s 150 ohms and R4 = 330)</w:t>
             </w:r>
           </w:p>
         </w:tc>
@@ -3470,7 +3563,7 @@
         </w:numPr>
       </w:pPr>
       <w:r>
-        <w:t xml:space="preserve">Check the datasheet values listed under Schematic above.</w:t>
+        <w:t xml:space="preserve">On the breadboard, confirm the digital pots behave as expected from a 9V supply.</w:t>
       </w:r>
     </w:p>
     <w:p>

</xml_diff>

<commit_message>
Add Flashover generator scripts; update product document for two boards
- pedals/distortion/kicad/scripts: schematic, placement, fan-out and
  autorouting scripts, with paths relative to the repo and a README
- Product document: new Circuit boards section; sheet table shows the board
- Status note: record the rejected +3V3 plane experiment; hand-routing next

Co-Authored-By: Claude Opus 5.5 <noreply@anthropic.com>
</commit_message>
<xml_diff>
--- a/pedals/distortion/Flashover Product Document.docx
+++ b/pedals/distortion/Flashover Product Document.docx
@@ -169,7 +169,7 @@
               <w:spacing w:before="0" w:after="0"/>
             </w:pPr>
             <w:r>
-              <w:t xml:space="preserve">Draft — schematic drawn (version 0.1); breadboard prototype next</w:t>
+              <w:t xml:space="preserve">Draft — schematic drawn and parts placed on two circuit boards (version 0.1); board wiring in progress; breadboard prototype next</w:t>
             </w:r>
           </w:p>
         </w:tc>
@@ -200,7 +200,7 @@
               <w:spacing w:before="0" w:after="0"/>
             </w:pPr>
             <w:r>
-              <w:t xml:space="preserve">pedals/distortion/ — Flashover KiCad schematic (kicad/Flashover), the original GS1 design (kicad/GS1) and LTspice simulations (sim/Flashover_*.cir)</w:t>
+              <w:t xml:space="preserve">pedals/distortion/ — KiCad projects for the main board (kicad/Flashover) and the control board (kicad/Flashover_Controls), the scripts that generate them (kicad/scripts), the original GS1 design (kicad/GS1) and LTspice simulations (sim/Flashover_*.cir)</w:t>
             </w:r>
           </w:p>
         </w:tc>
@@ -2260,7 +2260,7 @@
               <w:spacing w:before="0" w:after="0"/>
             </w:pPr>
             <w:r>
-              <w:t xml:space="preserve">Larger than a typical single pedal to fit three LED rings, the button and five jacks. Likely a 1590BB-size box (about 120 × 94 mm)</w:t>
+              <w:t xml:space="preserve">Hammond 1590BB (about 119.5 × 94 mm), larger than a typical single pedal to fit three LED rings, the button and five jacks. All five jacks are on the top (back) edge</w:t>
             </w:r>
           </w:p>
         </w:tc>
@@ -2308,7 +2308,7 @@
     </w:p>
     <w:p>
       <w:r>
-        <w:t xml:space="preserve">The Flashover schematic (version 0.1, October 2026) is a KiCad project in pedals/distortion/kicad/Flashover, split into ten sheets. The audio sheets match the LTspice model value for value.</w:t>
+        <w:t xml:space="preserve">The Flashover schematic (version 0.1, October 2026) is split into two KiCad projects, one for each circuit board: pedals/distortion/kicad/Flashover (main board) and pedals/distortion/kicad/Flashover_Controls (control board). The audio sheets match the LTspice model value for value.</w:t>
       </w:r>
     </w:p>
     <w:tbl>
@@ -2331,8 +2331,9 @@
         </w:tblCellMar>
       </w:tblPr>
       <w:tblGrid>
-        <w:gridCol w:w="2400"/>
-        <w:gridCol w:w="6960"/>
+        <w:gridCol w:w="2000"/>
+        <w:gridCol w:w="1100"/>
+        <w:gridCol w:w="6260"/>
       </w:tblGrid>
       <w:tr>
         <w:trPr>
@@ -2341,7 +2342,7 @@
         </w:trPr>
         <w:tc>
           <w:tcPr>
-            <w:tcW w:w="2400" w:type="dxa"/>
+            <w:tcW w:w="2000" w:type="dxa"/>
             <w:shd w:val="clear" w:color="auto" w:fill="E7E6E6"/>
           </w:tcPr>
           <w:p>
@@ -2358,7 +2359,24 @@
         </w:tc>
         <w:tc>
           <w:tcPr>
-            <w:tcW w:w="6960" w:type="dxa"/>
+            <w:tcW w:w="1100" w:type="dxa"/>
+            <w:shd w:val="clear" w:color="auto" w:fill="E7E6E6"/>
+          </w:tcPr>
+          <w:p>
+            <w:pPr>
+              <w:spacing w:before="0" w:after="0"/>
+            </w:pPr>
+            <w:r>
+              <w:rPr>
+                <w:b/>
+              </w:rPr>
+              <w:t xml:space="preserve">Board</w:t>
+            </w:r>
+          </w:p>
+        </w:tc>
+        <w:tc>
+          <w:tcPr>
+            <w:tcW w:w="6260" w:type="dxa"/>
             <w:shd w:val="clear" w:color="auto" w:fill="E7E6E6"/>
           </w:tcPr>
           <w:p>
@@ -2380,7 +2398,7 @@
         </w:trPr>
         <w:tc>
           <w:tcPr>
-            <w:tcW w:w="2400" w:type="dxa"/>
+            <w:tcW w:w="2000" w:type="dxa"/>
           </w:tcPr>
           <w:p>
             <w:pPr>
@@ -2393,25 +2411,38 @@
         </w:tc>
         <w:tc>
           <w:tcPr>
-            <w:tcW w:w="6960" w:type="dxa"/>
-          </w:tcPr>
-          <w:p>
-            <w:pPr>
-              <w:spacing w:before="0" w:after="0"/>
-            </w:pPr>
-            <w:r>
-              <w:t xml:space="preserve">Input and output jacks, bypass relay, footswitch, Link LED</w:t>
-            </w:r>
-          </w:p>
-        </w:tc>
-      </w:tr>
-      <w:tr>
-        <w:trPr>
-          <w:cantSplit/>
-        </w:trPr>
-        <w:tc>
-          <w:tcPr>
-            <w:tcW w:w="2400" w:type="dxa"/>
+            <w:tcW w:w="1100" w:type="dxa"/>
+          </w:tcPr>
+          <w:p>
+            <w:pPr>
+              <w:spacing w:before="0" w:after="0"/>
+            </w:pPr>
+            <w:r>
+              <w:t xml:space="preserve">Main</w:t>
+            </w:r>
+          </w:p>
+        </w:tc>
+        <w:tc>
+          <w:tcPr>
+            <w:tcW w:w="6260" w:type="dxa"/>
+          </w:tcPr>
+          <w:p>
+            <w:pPr>
+              <w:spacing w:before="0" w:after="0"/>
+            </w:pPr>
+            <w:r>
+              <w:t xml:space="preserve">Input and output jacks, bypass relay, footswitch</w:t>
+            </w:r>
+          </w:p>
+        </w:tc>
+      </w:tr>
+      <w:tr>
+        <w:trPr>
+          <w:cantSplit/>
+        </w:trPr>
+        <w:tc>
+          <w:tcPr>
+            <w:tcW w:w="2000" w:type="dxa"/>
           </w:tcPr>
           <w:p>
             <w:pPr>
@@ -2424,7 +2455,20 @@
         </w:tc>
         <w:tc>
           <w:tcPr>
-            <w:tcW w:w="6960" w:type="dxa"/>
+            <w:tcW w:w="1100" w:type="dxa"/>
+          </w:tcPr>
+          <w:p>
+            <w:pPr>
+              <w:spacing w:before="0" w:after="0"/>
+            </w:pPr>
+            <w:r>
+              <w:t xml:space="preserve">Main</w:t>
+            </w:r>
+          </w:p>
+        </w:tc>
+        <w:tc>
+          <w:tcPr>
+            <w:tcW w:w="6260" w:type="dxa"/>
           </w:tcPr>
           <w:p>
             <w:pPr>
@@ -2442,7 +2486,7 @@
         </w:trPr>
         <w:tc>
           <w:tcPr>
-            <w:tcW w:w="2400" w:type="dxa"/>
+            <w:tcW w:w="2000" w:type="dxa"/>
           </w:tcPr>
           <w:p>
             <w:pPr>
@@ -2455,7 +2499,20 @@
         </w:tc>
         <w:tc>
           <w:tcPr>
-            <w:tcW w:w="6960" w:type="dxa"/>
+            <w:tcW w:w="1100" w:type="dxa"/>
+          </w:tcPr>
+          <w:p>
+            <w:pPr>
+              <w:spacing w:before="0" w:after="0"/>
+            </w:pPr>
+            <w:r>
+              <w:t xml:space="preserve">Main</w:t>
+            </w:r>
+          </w:p>
+        </w:tc>
+        <w:tc>
+          <w:tcPr>
+            <w:tcW w:w="6260" w:type="dxa"/>
           </w:tcPr>
           <w:p>
             <w:pPr>
@@ -2473,7 +2530,7 @@
         </w:trPr>
         <w:tc>
           <w:tcPr>
-            <w:tcW w:w="2400" w:type="dxa"/>
+            <w:tcW w:w="2000" w:type="dxa"/>
           </w:tcPr>
           <w:p>
             <w:pPr>
@@ -2486,7 +2543,20 @@
         </w:tc>
         <w:tc>
           <w:tcPr>
-            <w:tcW w:w="6960" w:type="dxa"/>
+            <w:tcW w:w="1100" w:type="dxa"/>
+          </w:tcPr>
+          <w:p>
+            <w:pPr>
+              <w:spacing w:before="0" w:after="0"/>
+            </w:pPr>
+            <w:r>
+              <w:t xml:space="preserve">Main</w:t>
+            </w:r>
+          </w:p>
+        </w:tc>
+        <w:tc>
+          <w:tcPr>
+            <w:tcW w:w="6260" w:type="dxa"/>
           </w:tcPr>
           <w:p>
             <w:pPr>
@@ -2504,7 +2574,7 @@
         </w:trPr>
         <w:tc>
           <w:tcPr>
-            <w:tcW w:w="2400" w:type="dxa"/>
+            <w:tcW w:w="2000" w:type="dxa"/>
           </w:tcPr>
           <w:p>
             <w:pPr>
@@ -2517,7 +2587,20 @@
         </w:tc>
         <w:tc>
           <w:tcPr>
-            <w:tcW w:w="6960" w:type="dxa"/>
+            <w:tcW w:w="1100" w:type="dxa"/>
+          </w:tcPr>
+          <w:p>
+            <w:pPr>
+              <w:spacing w:before="0" w:after="0"/>
+            </w:pPr>
+            <w:r>
+              <w:t xml:space="preserve">Main</w:t>
+            </w:r>
+          </w:p>
+        </w:tc>
+        <w:tc>
+          <w:tcPr>
+            <w:tcW w:w="6260" w:type="dxa"/>
           </w:tcPr>
           <w:p>
             <w:pPr>
@@ -2535,7 +2618,7 @@
         </w:trPr>
         <w:tc>
           <w:tcPr>
-            <w:tcW w:w="2400" w:type="dxa"/>
+            <w:tcW w:w="2000" w:type="dxa"/>
           </w:tcPr>
           <w:p>
             <w:pPr>
@@ -2548,7 +2631,20 @@
         </w:tc>
         <w:tc>
           <w:tcPr>
-            <w:tcW w:w="6960" w:type="dxa"/>
+            <w:tcW w:w="1100" w:type="dxa"/>
+          </w:tcPr>
+          <w:p>
+            <w:pPr>
+              <w:spacing w:before="0" w:after="0"/>
+            </w:pPr>
+            <w:r>
+              <w:t xml:space="preserve">Main</w:t>
+            </w:r>
+          </w:p>
+        </w:tc>
+        <w:tc>
+          <w:tcPr>
+            <w:tcW w:w="6260" w:type="dxa"/>
           </w:tcPr>
           <w:p>
             <w:pPr>
@@ -2566,7 +2662,7 @@
         </w:trPr>
         <w:tc>
           <w:tcPr>
-            <w:tcW w:w="2400" w:type="dxa"/>
+            <w:tcW w:w="2000" w:type="dxa"/>
           </w:tcPr>
           <w:p>
             <w:pPr>
@@ -2579,7 +2675,20 @@
         </w:tc>
         <w:tc>
           <w:tcPr>
-            <w:tcW w:w="6960" w:type="dxa"/>
+            <w:tcW w:w="1100" w:type="dxa"/>
+          </w:tcPr>
+          <w:p>
+            <w:pPr>
+              <w:spacing w:before="0" w:after="0"/>
+            </w:pPr>
+            <w:r>
+              <w:t xml:space="preserve">Main</w:t>
+            </w:r>
+          </w:p>
+        </w:tc>
+        <w:tc>
+          <w:tcPr>
+            <w:tcW w:w="6260" w:type="dxa"/>
           </w:tcPr>
           <w:p>
             <w:pPr>
@@ -2597,7 +2706,95 @@
         </w:trPr>
         <w:tc>
           <w:tcPr>
-            <w:tcW w:w="2400" w:type="dxa"/>
+            <w:tcW w:w="2000" w:type="dxa"/>
+          </w:tcPr>
+          <w:p>
+            <w:pPr>
+              <w:spacing w:before="0" w:after="0"/>
+            </w:pPr>
+            <w:r>
+              <w:t xml:space="preserve">MIDI</w:t>
+            </w:r>
+          </w:p>
+        </w:tc>
+        <w:tc>
+          <w:tcPr>
+            <w:tcW w:w="1100" w:type="dxa"/>
+          </w:tcPr>
+          <w:p>
+            <w:pPr>
+              <w:spacing w:before="0" w:after="0"/>
+            </w:pPr>
+            <w:r>
+              <w:t xml:space="preserve">Main</w:t>
+            </w:r>
+          </w:p>
+        </w:tc>
+        <w:tc>
+          <w:tcPr>
+            <w:tcW w:w="6260" w:type="dxa"/>
+          </w:tcPr>
+          <w:p>
+            <w:pPr>
+              <w:spacing w:before="0" w:after="0"/>
+            </w:pPr>
+            <w:r>
+              <w:t xml:space="preserve">MIDI in and MIDI out on 3.5 mm TRS jacks</w:t>
+            </w:r>
+          </w:p>
+        </w:tc>
+      </w:tr>
+      <w:tr>
+        <w:trPr>
+          <w:cantSplit/>
+        </w:trPr>
+        <w:tc>
+          <w:tcPr>
+            <w:tcW w:w="2000" w:type="dxa"/>
+          </w:tcPr>
+          <w:p>
+            <w:pPr>
+              <w:spacing w:before="0" w:after="0"/>
+            </w:pPr>
+            <w:r>
+              <w:t xml:space="preserve">Board Connector</w:t>
+            </w:r>
+          </w:p>
+        </w:tc>
+        <w:tc>
+          <w:tcPr>
+            <w:tcW w:w="1100" w:type="dxa"/>
+          </w:tcPr>
+          <w:p>
+            <w:pPr>
+              <w:spacing w:before="0" w:after="0"/>
+            </w:pPr>
+            <w:r>
+              <w:t xml:space="preserve">Both</w:t>
+            </w:r>
+          </w:p>
+        </w:tc>
+        <w:tc>
+          <w:tcPr>
+            <w:tcW w:w="6260" w:type="dxa"/>
+          </w:tcPr>
+          <w:p>
+            <w:pPr>
+              <w:spacing w:before="0" w:after="0"/>
+            </w:pPr>
+            <w:r>
+              <w:t xml:space="preserve">The 20-pin connector between the boards (J7 on the main board, J8 on the control board) and the mounting holes</w:t>
+            </w:r>
+          </w:p>
+        </w:tc>
+      </w:tr>
+      <w:tr>
+        <w:trPr>
+          <w:cantSplit/>
+        </w:trPr>
+        <w:tc>
+          <w:tcPr>
+            <w:tcW w:w="2000" w:type="dxa"/>
           </w:tcPr>
           <w:p>
             <w:pPr>
@@ -2610,7 +2807,20 @@
         </w:tc>
         <w:tc>
           <w:tcPr>
-            <w:tcW w:w="6960" w:type="dxa"/>
+            <w:tcW w:w="1100" w:type="dxa"/>
+          </w:tcPr>
+          <w:p>
+            <w:pPr>
+              <w:spacing w:before="0" w:after="0"/>
+            </w:pPr>
+            <w:r>
+              <w:t xml:space="preserve">Control</w:t>
+            </w:r>
+          </w:p>
+        </w:tc>
+        <w:tc>
+          <w:tcPr>
+            <w:tcW w:w="6260" w:type="dxa"/>
           </w:tcPr>
           <w:p>
             <w:pPr>
@@ -2628,7 +2838,7 @@
         </w:trPr>
         <w:tc>
           <w:tcPr>
-            <w:tcW w:w="2400" w:type="dxa"/>
+            <w:tcW w:w="2000" w:type="dxa"/>
           </w:tcPr>
           <w:p>
             <w:pPr>
@@ -2641,51 +2851,245 @@
         </w:tc>
         <w:tc>
           <w:tcPr>
-            <w:tcW w:w="6960" w:type="dxa"/>
-          </w:tcPr>
-          <w:p>
-            <w:pPr>
-              <w:spacing w:before="0" w:after="0"/>
-            </w:pPr>
-            <w:r>
-              <w:t xml:space="preserve">LED driver, three 11-LED rings, Soft, Hard and On LEDs</w:t>
-            </w:r>
-          </w:p>
-        </w:tc>
-      </w:tr>
-      <w:tr>
-        <w:trPr>
-          <w:cantSplit/>
-        </w:trPr>
-        <w:tc>
-          <w:tcPr>
-            <w:tcW w:w="2400" w:type="dxa"/>
-          </w:tcPr>
-          <w:p>
-            <w:pPr>
-              <w:spacing w:before="0" w:after="0"/>
-            </w:pPr>
-            <w:r>
-              <w:t xml:space="preserve">MIDI</w:t>
-            </w:r>
-          </w:p>
-        </w:tc>
-        <w:tc>
-          <w:tcPr>
-            <w:tcW w:w="6960" w:type="dxa"/>
-          </w:tcPr>
-          <w:p>
-            <w:pPr>
-              <w:spacing w:before="0" w:after="0"/>
-            </w:pPr>
-            <w:r>
-              <w:t xml:space="preserve">MIDI in and MIDI out on 3.5 mm TRS jacks</w:t>
+            <w:tcW w:w="1100" w:type="dxa"/>
+          </w:tcPr>
+          <w:p>
+            <w:pPr>
+              <w:spacing w:before="0" w:after="0"/>
+            </w:pPr>
+            <w:r>
+              <w:t xml:space="preserve">Control</w:t>
+            </w:r>
+          </w:p>
+        </w:tc>
+        <w:tc>
+          <w:tcPr>
+            <w:tcW w:w="6260" w:type="dxa"/>
+          </w:tcPr>
+          <w:p>
+            <w:pPr>
+              <w:spacing w:before="0" w:after="0"/>
+            </w:pPr>
+            <w:r>
+              <w:t xml:space="preserve">LED driver, three 11-LED rings, Soft, Hard, On and Link LEDs</w:t>
             </w:r>
           </w:p>
         </w:tc>
       </w:tr>
     </w:tbl>
     <w:p/>
+    <w:p>
+      <w:pPr>
+        <w:pStyle w:val="Heading1"/>
+      </w:pPr>
+      <w:r>
+        <w:t xml:space="preserve">Circuit boards</w:t>
+      </w:r>
+    </w:p>
+    <w:p>
+      <w:r>
+        <w:t xml:space="preserve">Flashover is built on two 4-layer circuit boards stacked inside the enclosure (October 2026):</w:t>
+      </w:r>
+    </w:p>
+    <w:tbl>
+      <w:tblPr>
+        <w:tblW w:w="9360" w:type="dxa"/>
+        <w:tblBorders>
+          <w:top w:val="single" w:sz="4" w:space="0" w:color="A0A0A0"/>
+          <w:left w:val="single" w:sz="4" w:space="0" w:color="A0A0A0"/>
+          <w:bottom w:val="single" w:sz="4" w:space="0" w:color="A0A0A0"/>
+          <w:right w:val="single" w:sz="4" w:space="0" w:color="A0A0A0"/>
+          <w:insideH w:val="single" w:sz="4" w:space="0" w:color="A0A0A0"/>
+          <w:insideV w:val="single" w:sz="4" w:space="0" w:color="A0A0A0"/>
+        </w:tblBorders>
+        <w:tblLayout w:type="fixed"/>
+        <w:tblCellMar>
+          <w:top w:w="40" w:type="dxa"/>
+          <w:left w:w="100" w:type="dxa"/>
+          <w:bottom w:w="40" w:type="dxa"/>
+          <w:right w:w="100" w:type="dxa"/>
+        </w:tblCellMar>
+      </w:tblPr>
+      <w:tblGrid>
+        <w:gridCol w:w="2000"/>
+        <w:gridCol w:w="7360"/>
+      </w:tblGrid>
+      <w:tr>
+        <w:trPr>
+          <w:cantSplit/>
+          <w:tblHeader/>
+        </w:trPr>
+        <w:tc>
+          <w:tcPr>
+            <w:tcW w:w="2000" w:type="dxa"/>
+            <w:shd w:val="clear" w:color="auto" w:fill="E7E6E6"/>
+          </w:tcPr>
+          <w:p>
+            <w:pPr>
+              <w:spacing w:before="0" w:after="0"/>
+            </w:pPr>
+            <w:r>
+              <w:rPr>
+                <w:b/>
+              </w:rPr>
+              <w:t xml:space="preserve">Board</w:t>
+            </w:r>
+          </w:p>
+        </w:tc>
+        <w:tc>
+          <w:tcPr>
+            <w:tcW w:w="7360" w:type="dxa"/>
+            <w:shd w:val="clear" w:color="auto" w:fill="E7E6E6"/>
+          </w:tcPr>
+          <w:p>
+            <w:pPr>
+              <w:spacing w:before="0" w:after="0"/>
+            </w:pPr>
+            <w:r>
+              <w:rPr>
+                <w:b/>
+              </w:rPr>
+              <w:t xml:space="preserve">What is on it</w:t>
+            </w:r>
+          </w:p>
+        </w:tc>
+      </w:tr>
+      <w:tr>
+        <w:trPr>
+          <w:cantSplit/>
+        </w:trPr>
+        <w:tc>
+          <w:tcPr>
+            <w:tcW w:w="2000" w:type="dxa"/>
+          </w:tcPr>
+          <w:p>
+            <w:pPr>
+              <w:spacing w:before="0" w:after="0"/>
+            </w:pPr>
+            <w:r>
+              <w:t xml:space="preserve">Control board</w:t>
+            </w:r>
+          </w:p>
+        </w:tc>
+        <w:tc>
+          <w:tcPr>
+            <w:tcW w:w="7360" w:type="dxa"/>
+          </w:tcPr>
+          <w:p>
+            <w:pPr>
+              <w:spacing w:before="0" w:after="0"/>
+            </w:pPr>
+            <w:r>
+              <w:t xml:space="preserve">Sits just under the top panel. The three knobs with their LED rings, the LED driver, the Soft/Hard button and the four panel LEDs</w:t>
+            </w:r>
+          </w:p>
+        </w:tc>
+      </w:tr>
+      <w:tr>
+        <w:trPr>
+          <w:cantSplit/>
+        </w:trPr>
+        <w:tc>
+          <w:tcPr>
+            <w:tcW w:w="2000" w:type="dxa"/>
+          </w:tcPr>
+          <w:p>
+            <w:pPr>
+              <w:spacing w:before="0" w:after="0"/>
+            </w:pPr>
+            <w:r>
+              <w:t xml:space="preserve">Main board</w:t>
+            </w:r>
+          </w:p>
+        </w:tc>
+        <w:tc>
+          <w:tcPr>
+            <w:tcW w:w="7360" w:type="dxa"/>
+          </w:tcPr>
+          <w:p>
+            <w:pPr>
+              <w:spacing w:before="0" w:after="0"/>
+            </w:pPr>
+            <w:r>
+              <w:t xml:space="preserve">Sits below the control board. The audio circuit, microcontroller, digital pots, MIDI, bypass relay, power, and all five jacks along the top edge</w:t>
+            </w:r>
+          </w:p>
+        </w:tc>
+      </w:tr>
+    </w:tbl>
+    <w:p/>
+    <w:p>
+      <w:pPr>
+        <w:pStyle w:val="ListParagraph"/>
+        <w:numPr>
+          <w:ilvl w:val="0"/>
+          <w:numId w:val="90"/>
+        </w:numPr>
+      </w:pPr>
+      <w:r>
+        <w:rPr>
+          <w:b/>
+        </w:rPr>
+        <w:t xml:space="preserve">Connection:</w:t>
+      </w:r>
+      <w:r>
+        <w:t xml:space="preserve"> the control board plugs into the main board through a 20-pin connector carrying 5V, 3.3V and ground, the LED driver’s I²C bus, the knob and button signals, and the Link LED. Two M3 spacers hold the boards together.</w:t>
+      </w:r>
+    </w:p>
+    <w:p>
+      <w:pPr>
+        <w:pStyle w:val="ListParagraph"/>
+        <w:numPr>
+          <w:ilvl w:val="0"/>
+          <w:numId w:val="90"/>
+        </w:numPr>
+      </w:pPr>
+      <w:r>
+        <w:rPr>
+          <w:b/>
+        </w:rPr>
+        <w:t xml:space="preserve">Panel layout (looking down):</w:t>
+      </w:r>
+      <w:r>
+        <w:t xml:space="preserve"> Gain and Level side by side at the top with Tone below and centred, the Soft/Hard button at the lower left with its LEDs above it, the On LED above the footswitch and the Link LED under the Level knob.</w:t>
+      </w:r>
+    </w:p>
+    <w:p>
+      <w:pPr>
+        <w:pStyle w:val="ListParagraph"/>
+        <w:numPr>
+          <w:ilvl w:val="0"/>
+          <w:numId w:val="90"/>
+        </w:numPr>
+      </w:pPr>
+      <w:r>
+        <w:rPr>
+          <w:b/>
+        </w:rPr>
+        <w:t xml:space="preserve">Layers:</w:t>
+      </w:r>
+      <w:r>
+        <w:t xml:space="preserve"> each board has a solid ground layer inside it, which keeps the audio quiet. The main board also has a 3.3V layer for the logic; the control board has a 5V layer for the LEDs.</w:t>
+      </w:r>
+    </w:p>
+    <w:p>
+      <w:pPr>
+        <w:pStyle w:val="ListParagraph"/>
+        <w:numPr>
+          <w:ilvl w:val="0"/>
+          <w:numId w:val="90"/>
+        </w:numPr>
+      </w:pPr>
+      <w:r>
+        <w:rPr>
+          <w:b/>
+        </w:rPr>
+        <w:t xml:space="preserve">To check against real parts before ordering:</w:t>
+      </w:r>
+      <w:r>
+        <w:t xml:space="preserve"> jack spacing (about 1 mm between the jack bodies), the enclosure’s wall and screw-post sizes, the height between the boards, the panel holes or light pipes for the ring LEDs, and the encoder footprint.</w:t>
+      </w:r>
+    </w:p>
     <w:p>
       <w:r>
         <w:rPr>
@@ -3575,7 +3979,7 @@
         </w:numPr>
       </w:pPr>
       <w:r>
-        <w:t xml:space="preserve">Assign footprints and lay out the circuit board.</w:t>
+        <w:t xml:space="preserve">Finish wiring (routing) both circuit boards, check them against the real parts, and order prototype boards.</w:t>
       </w:r>
     </w:p>
     <w:p>

</xml_diff>

<commit_message>
Fit Flashover to the 1590BB and part datasheets
- Correct PEC11R encoder footprint (legs 13.2 mm apart) in a new
  GreywireStudio footprint library; swap it onto the control board and
  bend three tracks around the wider legs
- Move MIDI jacks to the side walls, spread the top jacks out and put
  their fronts against the wall; re-autoroute the main board
- gen_pcb.py rebuilds the control board only with --controls
- Add fit check, board heights and drilling guide to the status note;
  update the product document

Co-Authored-By: Claude Opus 5.5 <noreply@anthropic.com>
</commit_message>
<xml_diff>
--- a/pedals/distortion/Flashover Product Document.docx
+++ b/pedals/distortion/Flashover Product Document.docx
@@ -1950,7 +1950,7 @@
               <w:spacing w:before="0" w:after="0"/>
             </w:pPr>
             <w:r>
-              <w:t xml:space="preserve">Guitar input, amp output (1/4"); MIDI in and MIDI out (3.5 mm TRS); 9V DC power (2.1 mm, center negative)</w:t>
+              <w:t xml:space="preserve">Guitar input, amp output (1/4", Neutrik NRJ4HF) and 9V DC power (2.1 mm, center negative) on the top (back) wall; MIDI out and MIDI in (3.5 mm TRS) on the left and right walls</w:t>
             </w:r>
           </w:p>
         </w:tc>
@@ -2043,7 +2043,7 @@
               <w:spacing w:before="0" w:after="0"/>
             </w:pPr>
             <w:r>
-              <w:t xml:space="preserve">Three endless rotary encoders with push switches (Bourns PEC11R type), each with an 11-LED ring</w:t>
+              <w:t xml:space="preserve">Three endless rotary encoders with push switches (Bourns PEC11R-4220F-S0024, 20 mm shaft, bolted to the panel), each with an 11-LED ring</w:t>
             </w:r>
           </w:p>
         </w:tc>
@@ -2260,7 +2260,7 @@
               <w:spacing w:before="0" w:after="0"/>
             </w:pPr>
             <w:r>
-              <w:t xml:space="preserve">Hammond 1590BB (about 119.5 × 94 mm), larger than a typical single pedal to fit three LED rings, the button and five jacks. All five jacks are on the top (back) edge</w:t>
+              <w:t xml:space="preserve">Hammond 1590BB (about 119.5 × 94 × 34 mm, walls about 3 mm), larger than a typical single pedal to fit three LED rings, the button and five jacks. Output, DC and Input on the top (back) wall; MIDI on the side walls</w:t>
             </w:r>
           </w:p>
         </w:tc>
@@ -3011,7 +3011,7 @@
               <w:spacing w:before="0" w:after="0"/>
             </w:pPr>
             <w:r>
-              <w:t xml:space="preserve">Sits below the control board. The audio circuit, microcontroller, digital pots, MIDI, bypass relay, power, and all five jacks along the top edge</w:t>
+              <w:t xml:space="preserve">Sits below the control board. The audio circuit, microcontroller, digital pots, MIDI, bypass relay, power, and all five jacks: three along the top edge and the two MIDI jacks on the side edges</w:t>
             </w:r>
           </w:p>
         </w:tc>
@@ -3069,7 +3069,7 @@
         <w:t xml:space="preserve">Layers:</w:t>
       </w:r>
       <w:r>
-        <w:t xml:space="preserve"> each board has a solid ground layer inside it, which keeps the audio quiet. The main board also has a 3.3V layer for the logic; the control board has a 5V layer for the LEDs.</w:t>
+        <w:t xml:space="preserve"> each board has a solid ground layer inside it, which keeps the audio quiet. The control board also has a 5V layer for the LEDs.</w:t>
       </w:r>
     </w:p>
     <w:p>
@@ -3084,10 +3084,46 @@
         <w:rPr>
           <w:b/>
         </w:rPr>
-        <w:t xml:space="preserve">To check against real parts before ordering:</w:t>
-      </w:r>
-      <w:r>
-        <w:t xml:space="preserve"> jack spacing (about 1 mm between the jack bodies), the enclosure’s wall and screw-post sizes, the height between the boards, the panel holes or light pipes for the ring LEDs, and the encoder footprint.</w:t>
+        <w:t xml:space="preserve">Heights:</w:t>
+      </w:r>
+      <w:r>
+        <w:t xml:space="preserve"> the control board sits 6.5 mm below the inside of the panel, so the encoder bodies press against the panel and their nuts clamp from outside. The main board is 11 mm below the control board (an 8.5 mm socket plus a pin header), held by 11 mm M3 spacers.</w:t>
+      </w:r>
+    </w:p>
+    <w:p>
+      <w:pPr>
+        <w:pStyle w:val="ListParagraph"/>
+        <w:numPr>
+          <w:ilvl w:val="0"/>
+          <w:numId w:val="90"/>
+        </w:numPr>
+      </w:pPr>
+      <w:r>
+        <w:rPr>
+          <w:b/>
+        </w:rPr>
+        <w:t xml:space="preserve">Fit check (October 2026):</w:t>
+      </w:r>
+      <w:r>
+        <w:t xml:space="preserve"> the boards were checked against the manufacturers’ drawings of the 1590BB, the encoders and the jacks. The encoder footprint was corrected (the mounting legs are 13.2 mm apart). The MIDI jacks moved to the side walls so nothing is cramped. Because the walls are about 3 mm thick, the DC and MIDI holes get a shallow, wider pocket on the outside so plugs seat fully. Hole positions and sizes are in kicad/FLASHOVER_STATUS.md.</w:t>
+      </w:r>
+    </w:p>
+    <w:p>
+      <w:pPr>
+        <w:pStyle w:val="ListParagraph"/>
+        <w:numPr>
+          <w:ilvl w:val="0"/>
+          <w:numId w:val="90"/>
+        </w:numPr>
+      </w:pPr>
+      <w:r>
+        <w:rPr>
+          <w:b/>
+        </w:rPr>
+        <w:t xml:space="preserve">Still to check with real parts:</w:t>
+      </w:r>
+      <w:r>
+        <w:t xml:space="preserve"> panel holes or light pipes for the ring LEDs, the Soft/Hard button cap, and the real wall thickness.</w:t>
       </w:r>
     </w:p>
     <w:p>

</xml_diff>